<commit_message>
Make D.P. the sole CV template and preserve its native spacing and bullets
</commit_message>
<xml_diff>
--- a/skills/bto-cv/assets/BTO_CV_Template.docx
+++ b/skills/bto-cv/assets/BTO_CV_Template.docx
@@ -55,7 +55,6 @@
     <w:p>
       <w:pPr>
         <w:spacing w:after="0" w:line="240" w:lineRule="auto"/>
-        <w:ind w:left="426" w:hanging="284"/>
         <w:jc w:val="center"/>
         <w:rPr>
           <w:rFonts w:ascii="Century Gothic" w:hAnsi="Century Gothic"/>
@@ -73,7 +72,6 @@
     <w:p>
       <w:pPr>
         <w:spacing w:after="0" w:line="240" w:lineRule="auto"/>
-        <w:ind w:left="426" w:hanging="284"/>
         <w:rPr>
           <w:rFonts w:ascii="Century Gothic" w:hAnsi="Century Gothic"/>
         </w:rPr>
@@ -86,19 +84,28 @@
       <w:pPr>
         <w:keepNext/>
         <w:spacing w:after="0" w:line="240" w:lineRule="auto"/>
-        <w:ind w:left="426" w:hanging="284"/>
-        <w:rPr>
-          <w:rFonts w:ascii="Century Gothic" w:hAnsi="Century Gothic"/>
-        </w:rPr>
-      </w:pPr>
-      <w:r>
         <w:rPr>
           <w:rFonts w:ascii="Century Gothic" w:hAnsi="Century Gothic"/>
           <w:b/>
           <w:color w:val="00665E"/>
           <w:sz w:val="26"/>
         </w:rPr>
-        <w:t>WORK EXPERIENCE</w:t>
+      </w:pPr>
+      <w:r>
+        <w:t>{{heading_gap}}</w:t>
+      </w:r>
+    </w:p>
+    <w:p>
+      <w:pPr>
+        <w:keepLines/>
+        <w:spacing w:after="0" w:line="240" w:lineRule="auto"/>
+        <w:ind w:left="567"/>
+        <w:rPr>
+          <w:rFonts w:ascii="Century Gothic" w:hAnsi="Century Gothic"/>
+        </w:rPr>
+      </w:pPr>
+      <w:r>
+        <w:t>{{list_gap}}</w:t>
       </w:r>
     </w:p>
     <w:p>
@@ -115,6 +122,122 @@
           <w:rFonts w:ascii="Century Gothic" w:hAnsi="Century Gothic"/>
           <w:b/>
         </w:rPr>
+        <w:t>{{first_dates}}</w:t>
+      </w:r>
+    </w:p>
+    <w:p>
+      <w:pPr>
+        <w:keepNext/>
+        <w:spacing w:after="0" w:line="240" w:lineRule="auto"/>
+        <w:ind w:left="426" w:hanging="284"/>
+        <w:rPr>
+          <w:rFonts w:ascii="Century Gothic" w:hAnsi="Century Gothic"/>
+          <w:b/>
+        </w:rPr>
+      </w:pPr>
+      <w:r>
+        <w:rPr>
+          <w:rFonts w:ascii="Century Gothic" w:hAnsi="Century Gothic"/>
+          <w:b/>
+        </w:rPr>
+        <w:t>{{first_role}}</w:t>
+      </w:r>
+    </w:p>
+    <w:p>
+      <w:pPr>
+        <w:keepNext/>
+        <w:spacing w:after="0" w:line="240" w:lineRule="auto"/>
+        <w:ind w:left="426" w:hanging="284"/>
+        <w:rPr>
+          <w:rFonts w:ascii="Century Gothic" w:hAnsi="Century Gothic"/>
+        </w:rPr>
+      </w:pPr>
+      <w:r>
+        <w:rPr>
+          <w:rFonts w:ascii="Century Gothic" w:hAnsi="Century Gothic"/>
+        </w:rPr>
+        <w:t>{{first_employer}}</w:t>
+      </w:r>
+    </w:p>
+    <w:p>
+      <w:pPr>
+        <w:keepNext/>
+        <w:spacing w:after="0" w:line="240" w:lineRule="auto"/>
+        <w:ind w:left="426" w:hanging="284"/>
+        <w:rPr>
+          <w:rFonts w:ascii="Century Gothic" w:hAnsi="Century Gothic"/>
+          <w:b/>
+          <w:u w:val="single"/>
+        </w:rPr>
+      </w:pPr>
+      <w:r>
+        <w:rPr>
+          <w:rFonts w:ascii="Century Gothic" w:hAnsi="Century Gothic"/>
+          <w:b/>
+          <w:u w:val="single"/>
+        </w:rPr>
+        <w:t>{{first_responsibilities}}</w:t>
+      </w:r>
+    </w:p>
+    <w:p>
+      <w:pPr>
+        <w:keepLines/>
+        <w:numPr>
+          <w:ilvl w:val="0"/>
+          <w:numId w:val="1"/>
+        </w:numPr>
+        <w:spacing w:after="0" w:line="240" w:lineRule="auto"/>
+        <w:ind w:left="567" w:hanging="387"/>
+        <w:rPr>
+          <w:rFonts w:ascii="Century Gothic" w:hAnsi="Century Gothic"/>
+        </w:rPr>
+      </w:pPr>
+      <w:r>
+        <w:rPr>
+          <w:rFonts w:ascii="Century Gothic" w:hAnsi="Century Gothic"/>
+        </w:rPr>
+        <w:t>{{experience_bullet}}</w:t>
+      </w:r>
+    </w:p>
+    <w:p>
+      <w:pPr>
+        <w:keepLines/>
+        <w:numPr>
+          <w:ilvl w:val="0"/>
+          <w:numId w:val="1"/>
+        </w:numPr>
+        <w:spacing w:after="0" w:line="240" w:lineRule="auto"/>
+        <w:ind w:left="567" w:hanging="387"/>
+        <w:rPr>
+          <w:rFonts w:ascii="Century Gothic" w:hAnsi="Century Gothic"/>
+        </w:rPr>
+      </w:pPr>
+      <w:r>
+        <w:rPr>
+          <w:rFonts w:ascii="Century Gothic" w:hAnsi="Century Gothic"/>
+        </w:rPr>
+        <w:t>{{first_last_bullet}}</w:t>
+      </w:r>
+      <w:r>
+        <w:rPr>
+          <w:rFonts w:ascii="Century Gothic" w:hAnsi="Century Gothic"/>
+        </w:rPr>
+        <w:br/>
+      </w:r>
+    </w:p>
+    <w:p>
+      <w:pPr>
+        <w:keepNext/>
+        <w:spacing w:after="0" w:line="240" w:lineRule="auto"/>
+        <w:rPr>
+          <w:rFonts w:ascii="Century Gothic" w:hAnsi="Century Gothic"/>
+        </w:rPr>
+      </w:pPr>
+      <w:r>
+        <w:rPr>
+          <w:rFonts w:ascii="Century Gothic" w:hAnsi="Century Gothic"/>
+          <w:b/>
+        </w:rPr>
         <w:t>{{dates}}</w:t>
       </w:r>
     </w:p>
@@ -122,7 +245,6 @@
       <w:pPr>
         <w:keepNext/>
         <w:spacing w:after="0" w:line="240" w:lineRule="auto"/>
-        <w:ind w:left="426" w:hanging="284"/>
         <w:rPr>
           <w:rFonts w:ascii="Century Gothic" w:hAnsi="Century Gothic"/>
         </w:rPr>
@@ -139,7 +261,6 @@
       <w:pPr>
         <w:keepNext/>
         <w:spacing w:after="0" w:line="240" w:lineRule="auto"/>
-        <w:ind w:left="426" w:hanging="284"/>
         <w:rPr>
           <w:rFonts w:ascii="Century Gothic" w:hAnsi="Century Gothic"/>
         </w:rPr>
@@ -155,7 +276,6 @@
       <w:pPr>
         <w:keepNext/>
         <w:spacing w:after="0" w:line="240" w:lineRule="auto"/>
-        <w:ind w:left="426" w:hanging="284"/>
         <w:rPr>
           <w:rFonts w:ascii="Century Gothic" w:hAnsi="Century Gothic"/>
         </w:rPr>
@@ -186,45 +306,6 @@
         <w:rPr>
           <w:rFonts w:ascii="Century Gothic" w:hAnsi="Century Gothic"/>
         </w:rPr>
-        <w:t>{{experience_bullet}}</w:t>
-      </w:r>
-    </w:p>
-    <w:p>
-      <w:pPr>
-        <w:keepNext/>
-        <w:spacing w:after="0" w:line="240" w:lineRule="auto"/>
-        <w:ind w:left="426" w:hanging="284"/>
-        <w:rPr>
-          <w:rFonts w:ascii="Century Gothic" w:hAnsi="Century Gothic"/>
-        </w:rPr>
-      </w:pPr>
-      <w:r>
-        <w:rPr>
-          <w:rFonts w:ascii="Century Gothic" w:hAnsi="Century Gothic"/>
-          <w:b/>
-          <w:color w:val="00665E"/>
-          <w:sz w:val="26"/>
-        </w:rPr>
-        <w:t>EDUCATION</w:t>
-      </w:r>
-    </w:p>
-    <w:p>
-      <w:pPr>
-        <w:keepLines/>
-        <w:numPr>
-          <w:ilvl w:val="0"/>
-          <w:numId w:val="1"/>
-        </w:numPr>
-        <w:spacing w:after="0" w:line="240" w:lineRule="auto"/>
-        <w:ind w:left="567" w:hanging="387"/>
-        <w:rPr>
-          <w:rFonts w:ascii="Century Gothic" w:hAnsi="Century Gothic"/>
-        </w:rPr>
-      </w:pPr>
-      <w:r>
-        <w:rPr>
-          <w:rFonts w:ascii="Century Gothic" w:hAnsi="Century Gothic"/>
-        </w:rPr>
         <w:t>{{education_bullet}}</w:t>
       </w:r>
     </w:p>
@@ -232,29 +313,6 @@
       <w:pPr>
         <w:keepNext/>
         <w:spacing w:after="0" w:line="240" w:lineRule="auto"/>
-        <w:ind w:left="426" w:hanging="284"/>
-        <w:rPr>
-          <w:rFonts w:ascii="Century Gothic" w:hAnsi="Century Gothic"/>
-          <w:b/>
-          <w:color w:val="00665E"/>
-          <w:sz w:val="26"/>
-        </w:rPr>
-      </w:pPr>
-      <w:r>
-        <w:rPr>
-          <w:rFonts w:ascii="Century Gothic" w:hAnsi="Century Gothic"/>
-          <w:b/>
-          <w:color w:val="00665E"/>
-          <w:sz w:val="26"/>
-        </w:rPr>
-        <w:t>IT SKILLS</w:t>
-      </w:r>
-    </w:p>
-    <w:p>
-      <w:pPr>
-        <w:keepNext/>
-        <w:spacing w:after="0" w:line="240" w:lineRule="auto"/>
-        <w:ind w:left="426" w:hanging="284"/>
         <w:rPr>
           <w:rFonts w:ascii="Century Gothic" w:hAnsi="Century Gothic"/>
         </w:rPr>
@@ -289,25 +347,6 @@
     </w:p>
     <w:p>
       <w:pPr>
-        <w:keepNext/>
-        <w:spacing w:after="0" w:line="240" w:lineRule="auto"/>
-        <w:ind w:left="426" w:hanging="284"/>
-        <w:rPr>
-          <w:rFonts w:ascii="Century Gothic" w:hAnsi="Century Gothic"/>
-        </w:rPr>
-      </w:pPr>
-      <w:r>
-        <w:rPr>
-          <w:rFonts w:ascii="Century Gothic" w:hAnsi="Century Gothic"/>
-          <w:b/>
-          <w:color w:val="00665E"/>
-          <w:sz w:val="26"/>
-        </w:rPr>
-        <w:t>CERTIFICATIONS AND TRAINING</w:t>
-      </w:r>
-    </w:p>
-    <w:p>
-      <w:pPr>
         <w:keepLines/>
         <w:numPr>
           <w:ilvl w:val="0"/>
@@ -328,25 +367,6 @@
     </w:p>
     <w:p>
       <w:pPr>
-        <w:keepNext/>
-        <w:spacing w:after="0" w:line="240" w:lineRule="auto"/>
-        <w:ind w:left="426" w:hanging="284"/>
-        <w:rPr>
-          <w:rFonts w:ascii="Century Gothic" w:hAnsi="Century Gothic"/>
-        </w:rPr>
-      </w:pPr>
-      <w:r>
-        <w:rPr>
-          <w:rFonts w:ascii="Century Gothic" w:hAnsi="Century Gothic"/>
-          <w:b/>
-          <w:color w:val="00665E"/>
-          <w:sz w:val="26"/>
-        </w:rPr>
-        <w:t>LANGUAGES</w:t>
-      </w:r>
-    </w:p>
-    <w:p>
-      <w:pPr>
         <w:keepLines/>
         <w:numPr>
           <w:ilvl w:val="0"/>
@@ -363,6 +383,102 @@
           <w:rFonts w:ascii="Century Gothic" w:hAnsi="Century Gothic"/>
         </w:rPr>
         <w:t>{{language_bullet}}</w:t>
+      </w:r>
+    </w:p>
+    <w:p>
+      <w:pPr>
+        <w:keepNext/>
+        <w:spacing w:after="0" w:line="240" w:lineRule="auto"/>
+        <w:rPr>
+          <w:rFonts w:ascii="Century Gothic" w:hAnsi="Century Gothic"/>
+          <w:b/>
+          <w:color w:val="00665E"/>
+          <w:sz w:val="26"/>
+        </w:rPr>
+      </w:pPr>
+      <w:r>
+        <w:rPr>
+          <w:rFonts w:ascii="Century Gothic" w:hAnsi="Century Gothic"/>
+          <w:b/>
+          <w:color w:val="00665E"/>
+          <w:sz w:val="26"/>
+        </w:rPr>
+        <w:t>WORK EXPERIENCE</w:t>
+      </w:r>
+    </w:p>
+    <w:p>
+      <w:pPr>
+        <w:keepNext/>
+        <w:spacing w:after="0" w:line="240" w:lineRule="auto"/>
+        <w:rPr>
+          <w:rFonts w:ascii="Century Gothic" w:hAnsi="Century Gothic"/>
+          <w:b/>
+          <w:color w:val="00665E"/>
+          <w:sz w:val="26"/>
+        </w:rPr>
+      </w:pPr>
+      <w:r>
+        <w:rPr>
+          <w:rFonts w:ascii="Century Gothic" w:hAnsi="Century Gothic"/>
+          <w:b/>
+          <w:color w:val="00665E"/>
+          <w:sz w:val="26"/>
+        </w:rPr>
+        <w:t>EDUCATION</w:t>
+      </w:r>
+    </w:p>
+    <w:p>
+      <w:pPr>
+        <w:keepNext/>
+        <w:spacing w:after="0" w:line="240" w:lineRule="auto"/>
+        <w:rPr>
+          <w:rFonts w:ascii="Century Gothic" w:hAnsi="Century Gothic"/>
+        </w:rPr>
+      </w:pPr>
+      <w:r>
+        <w:rPr>
+          <w:rFonts w:ascii="Century Gothic" w:hAnsi="Century Gothic"/>
+          <w:b/>
+          <w:color w:val="00665E"/>
+          <w:sz w:val="26"/>
+        </w:rPr>
+        <w:t>IT SKILLS</w:t>
+      </w:r>
+    </w:p>
+    <w:p>
+      <w:pPr>
+        <w:keepNext/>
+        <w:spacing w:after="0" w:line="240" w:lineRule="auto"/>
+        <w:rPr>
+          <w:rFonts w:ascii="Century Gothic" w:hAnsi="Century Gothic"/>
+        </w:rPr>
+      </w:pPr>
+      <w:r>
+        <w:rPr>
+          <w:rFonts w:ascii="Century Gothic" w:hAnsi="Century Gothic"/>
+          <w:b/>
+          <w:color w:val="00665E"/>
+          <w:sz w:val="26"/>
+        </w:rPr>
+        <w:t>CERTIFICATIONS AND TRAINING</w:t>
+      </w:r>
+    </w:p>
+    <w:p>
+      <w:pPr>
+        <w:keepNext/>
+        <w:spacing w:after="0" w:line="240" w:lineRule="auto"/>
+        <w:rPr>
+          <w:rFonts w:ascii="Century Gothic" w:hAnsi="Century Gothic"/>
+        </w:rPr>
+      </w:pPr>
+      <w:r>
+        <w:rPr>
+          <w:rFonts w:ascii="Century Gothic" w:hAnsi="Century Gothic"/>
+          <w:b/>
+          <w:color w:val="00665E"/>
+          <w:sz w:val="26"/>
+        </w:rPr>
+        <w:t>LANGUAGES</w:t>
       </w:r>
     </w:p>
     <w:sectPr>
@@ -1224,7 +1340,6 @@
   <w:style w:type="character" w:default="1" w:styleId="DefaultParagraphFont">
     <w:name w:val="Default Paragraph Font"/>
     <w:uiPriority w:val="1"/>
-    <w:semiHidden/>
     <w:unhideWhenUsed/>
   </w:style>
   <w:style w:type="table" w:default="1" w:styleId="TableNormal">

</xml_diff>

<commit_message>
Match R.R./A.F.R. Word layout and validate native square lists
</commit_message>
<xml_diff>
--- a/skills/bto-cv/assets/BTO_CV_Template.docx
+++ b/skills/bto-cv/assets/BTO_CV_Template.docx
@@ -4,22 +4,25 @@
   <w:body>
     <w:p>
       <w:pPr>
-        <w:ind w:left="426" w:hanging="284"/>
+        <w:spacing w:after="180"/>
+        <w:ind w:hanging="284"/>
         <w:jc w:val="center"/>
-        <w:rPr>
-          <w:rFonts w:ascii="Century Gothic" w:hAnsi="Century Gothic"/>
-        </w:rPr>
       </w:pPr>
       <w:r>
         <w:rPr>
-          <w:rFonts w:ascii="Century Gothic" w:hAnsi="Century Gothic"/>
           <w:noProof/>
         </w:rPr>
         <w:drawing>
-          <wp:inline distT="0" distB="0" distL="0" distR="0" wp14:anchorId="37BD356C" wp14:editId="70B74B92">
-            <wp:extent cx="6126480" cy="783386"/>
+          <wp:inline distT="0" distB="0" distL="0" distR="0" wp14:anchorId="31FBBCC0" wp14:editId="2184D20A">
+            <wp:extent cx="6172200" cy="789232"/>
             <wp:effectExtent l="0" t="0" r="0" b="0"/>
-            <wp:docPr id="1" name="Picture 1"/>
+            <wp:docPr id="1" name="Picture 1">
+              <a:extLst xmlns:a="http://schemas.openxmlformats.org/drawingml/2006/main">
+                <a:ext uri="{FF2B5EF4-FFF2-40B4-BE49-F238E27FC236}">
+                  <a16:creationId xmlns:a16="http://schemas.microsoft.com/office/drawing/2014/main" id="{CABBAD04-59CB-4B59-99AE-22D7CA434CDB}"/>
+                </a:ext>
+              </a:extLst>
+            </wp:docPr>
             <wp:cNvGraphicFramePr>
               <a:graphicFrameLocks xmlns:a="http://schemas.openxmlformats.org/drawingml/2006/main" noChangeAspect="1"/>
             </wp:cNvGraphicFramePr>
@@ -39,7 +42,7 @@
                   <pic:spPr>
                     <a:xfrm>
                       <a:off x="0" y="0"/>
-                      <a:ext cx="6126480" cy="783386"/>
+                      <a:ext cx="6172200" cy="789232"/>
                     </a:xfrm>
                     <a:prstGeom prst="rect">
                       <a:avLst/>
@@ -54,15 +57,11 @@
     </w:p>
     <w:p>
       <w:pPr>
-        <w:spacing w:after="0" w:line="240" w:lineRule="auto"/>
+        <w:spacing w:after="120" w:line="240" w:lineRule="auto"/>
         <w:jc w:val="center"/>
-        <w:rPr>
-          <w:rFonts w:ascii="Century Gothic" w:hAnsi="Century Gothic"/>
-        </w:rPr>
       </w:pPr>
       <w:r>
         <w:rPr>
-          <w:rFonts w:ascii="Century Gothic" w:hAnsi="Century Gothic"/>
           <w:b/>
           <w:sz w:val="32"/>
         </w:rPr>
@@ -71,171 +70,113 @@
     </w:p>
     <w:p>
       <w:pPr>
-        <w:spacing w:after="0" w:line="240" w:lineRule="auto"/>
-        <w:rPr>
-          <w:rFonts w:ascii="Century Gothic" w:hAnsi="Century Gothic"/>
-        </w:rPr>
+        <w:keepNext/>
+        <w:spacing w:before="110" w:after="80" w:line="240" w:lineRule="auto"/>
       </w:pPr>
       <w:r>
-        <w:t>{{gap}}</w:t>
+        <w:rPr>
+          <w:b/>
+          <w:color w:val="00665F"/>
+          <w:sz w:val="26"/>
+        </w:rPr>
+        <w:t>WORK EXPERIENCE</w:t>
+      </w:r>
+    </w:p>
+    <w:p>
+      <w:pPr>
+        <w:keepNext/>
+        <w:spacing w:before="110" w:after="80" w:line="240" w:lineRule="auto"/>
+      </w:pPr>
+      <w:r>
+        <w:rPr>
+          <w:b/>
+          <w:color w:val="00665F"/>
+          <w:sz w:val="26"/>
+        </w:rPr>
+        <w:t>E</w:t>
+      </w:r>
+      <w:r>
+        <w:rPr>
+          <w:b/>
+          <w:color w:val="00665F"/>
+          <w:sz w:val="26"/>
+        </w:rPr>
+        <w:t>DUCATION</w:t>
+      </w:r>
+    </w:p>
+    <w:p>
+      <w:pPr>
+        <w:keepNext/>
+        <w:spacing w:before="110" w:after="80" w:line="240" w:lineRule="auto"/>
+      </w:pPr>
+      <w:r>
+        <w:rPr>
+          <w:b/>
+          <w:color w:val="00665F"/>
+          <w:sz w:val="26"/>
+        </w:rPr>
+        <w:t>I</w:t>
+      </w:r>
+      <w:r>
+        <w:rPr>
+          <w:b/>
+          <w:color w:val="00665F"/>
+          <w:sz w:val="26"/>
+        </w:rPr>
+        <w:t>T SKILLS</w:t>
+      </w:r>
+    </w:p>
+    <w:p>
+      <w:pPr>
+        <w:keepNext/>
+        <w:spacing w:before="110" w:after="80" w:line="240" w:lineRule="auto"/>
+      </w:pPr>
+      <w:r>
+        <w:rPr>
+          <w:b/>
+          <w:color w:val="00665F"/>
+          <w:sz w:val="26"/>
+        </w:rPr>
+        <w:t>C</w:t>
+      </w:r>
+      <w:r>
+        <w:rPr>
+          <w:b/>
+          <w:color w:val="00665F"/>
+          <w:sz w:val="26"/>
+        </w:rPr>
+        <w:t>ERTIFICATIONS AND TRAINING</w:t>
+      </w:r>
+    </w:p>
+    <w:p>
+      <w:pPr>
+        <w:keepNext/>
+        <w:spacing w:before="110" w:after="80" w:line="240" w:lineRule="auto"/>
+      </w:pPr>
+      <w:r>
+        <w:rPr>
+          <w:b/>
+          <w:color w:val="00665F"/>
+          <w:sz w:val="26"/>
+        </w:rPr>
+        <w:t>L</w:t>
+      </w:r>
+      <w:r>
+        <w:rPr>
+          <w:b/>
+          <w:color w:val="00665F"/>
+          <w:sz w:val="26"/>
+        </w:rPr>
+        <w:t>ANGUAGES</w:t>
       </w:r>
     </w:p>
     <w:p>
       <w:pPr>
         <w:keepNext/>
         <w:spacing w:after="0" w:line="240" w:lineRule="auto"/>
-        <w:rPr>
-          <w:rFonts w:ascii="Century Gothic" w:hAnsi="Century Gothic"/>
-          <w:b/>
-          <w:color w:val="00665E"/>
-          <w:sz w:val="26"/>
-        </w:rPr>
-      </w:pPr>
-      <w:r>
-        <w:t>{{heading_gap}}</w:t>
-      </w:r>
-    </w:p>
-    <w:p>
-      <w:pPr>
-        <w:keepLines/>
-        <w:spacing w:after="0" w:line="240" w:lineRule="auto"/>
-        <w:ind w:left="567"/>
-        <w:rPr>
-          <w:rFonts w:ascii="Century Gothic" w:hAnsi="Century Gothic"/>
-        </w:rPr>
-      </w:pPr>
-      <w:r>
-        <w:t>{{list_gap}}</w:t>
-      </w:r>
-    </w:p>
-    <w:p>
-      <w:pPr>
-        <w:keepNext/>
-        <w:spacing w:after="0" w:line="240" w:lineRule="auto"/>
-        <w:ind w:left="426" w:hanging="284"/>
-        <w:rPr>
-          <w:rFonts w:ascii="Century Gothic" w:hAnsi="Century Gothic"/>
-        </w:rPr>
       </w:pPr>
       <w:r>
         <w:rPr>
-          <w:rFonts w:ascii="Century Gothic" w:hAnsi="Century Gothic"/>
-          <w:b/>
-        </w:rPr>
-        <w:t>{{first_dates}}</w:t>
-      </w:r>
-    </w:p>
-    <w:p>
-      <w:pPr>
-        <w:keepNext/>
-        <w:spacing w:after="0" w:line="240" w:lineRule="auto"/>
-        <w:ind w:left="426" w:hanging="284"/>
-        <w:rPr>
-          <w:rFonts w:ascii="Century Gothic" w:hAnsi="Century Gothic"/>
-          <w:b/>
-        </w:rPr>
-      </w:pPr>
-      <w:r>
-        <w:rPr>
-          <w:rFonts w:ascii="Century Gothic" w:hAnsi="Century Gothic"/>
-          <w:b/>
-        </w:rPr>
-        <w:t>{{first_role}}</w:t>
-      </w:r>
-    </w:p>
-    <w:p>
-      <w:pPr>
-        <w:keepNext/>
-        <w:spacing w:after="0" w:line="240" w:lineRule="auto"/>
-        <w:ind w:left="426" w:hanging="284"/>
-        <w:rPr>
-          <w:rFonts w:ascii="Century Gothic" w:hAnsi="Century Gothic"/>
-        </w:rPr>
-      </w:pPr>
-      <w:r>
-        <w:rPr>
-          <w:rFonts w:ascii="Century Gothic" w:hAnsi="Century Gothic"/>
-        </w:rPr>
-        <w:t>{{first_employer}}</w:t>
-      </w:r>
-    </w:p>
-    <w:p>
-      <w:pPr>
-        <w:keepNext/>
-        <w:spacing w:after="0" w:line="240" w:lineRule="auto"/>
-        <w:ind w:left="426" w:hanging="284"/>
-        <w:rPr>
-          <w:rFonts w:ascii="Century Gothic" w:hAnsi="Century Gothic"/>
-          <w:b/>
-          <w:u w:val="single"/>
-        </w:rPr>
-      </w:pPr>
-      <w:r>
-        <w:rPr>
-          <w:rFonts w:ascii="Century Gothic" w:hAnsi="Century Gothic"/>
-          <w:b/>
-          <w:u w:val="single"/>
-        </w:rPr>
-        <w:t>{{first_responsibilities}}</w:t>
-      </w:r>
-    </w:p>
-    <w:p>
-      <w:pPr>
-        <w:keepLines/>
-        <w:numPr>
-          <w:ilvl w:val="0"/>
-          <w:numId w:val="1"/>
-        </w:numPr>
-        <w:spacing w:after="0" w:line="240" w:lineRule="auto"/>
-        <w:ind w:left="567" w:hanging="387"/>
-        <w:rPr>
-          <w:rFonts w:ascii="Century Gothic" w:hAnsi="Century Gothic"/>
-        </w:rPr>
-      </w:pPr>
-      <w:r>
-        <w:rPr>
-          <w:rFonts w:ascii="Century Gothic" w:hAnsi="Century Gothic"/>
-        </w:rPr>
-        <w:t>{{experience_bullet}}</w:t>
-      </w:r>
-    </w:p>
-    <w:p>
-      <w:pPr>
-        <w:keepLines/>
-        <w:numPr>
-          <w:ilvl w:val="0"/>
-          <w:numId w:val="1"/>
-        </w:numPr>
-        <w:spacing w:after="0" w:line="240" w:lineRule="auto"/>
-        <w:ind w:left="567" w:hanging="387"/>
-        <w:rPr>
-          <w:rFonts w:ascii="Century Gothic" w:hAnsi="Century Gothic"/>
-        </w:rPr>
-      </w:pPr>
-      <w:r>
-        <w:rPr>
-          <w:rFonts w:ascii="Century Gothic" w:hAnsi="Century Gothic"/>
-        </w:rPr>
-        <w:t>{{first_last_bullet}}</w:t>
-      </w:r>
-      <w:r>
-        <w:rPr>
-          <w:rFonts w:ascii="Century Gothic" w:hAnsi="Century Gothic"/>
-        </w:rPr>
-        <w:br/>
-      </w:r>
-    </w:p>
-    <w:p>
-      <w:pPr>
-        <w:keepNext/>
-        <w:spacing w:after="0" w:line="240" w:lineRule="auto"/>
-        <w:rPr>
-          <w:rFonts w:ascii="Century Gothic" w:hAnsi="Century Gothic"/>
-        </w:rPr>
-      </w:pPr>
-      <w:r>
-        <w:rPr>
-          <w:rFonts w:ascii="Century Gothic" w:hAnsi="Century Gothic"/>
           <w:b/>
         </w:rPr>
         <w:t>{{dates}}</w:t>
@@ -245,13 +186,9 @@
       <w:pPr>
         <w:keepNext/>
         <w:spacing w:after="0" w:line="240" w:lineRule="auto"/>
-        <w:rPr>
-          <w:rFonts w:ascii="Century Gothic" w:hAnsi="Century Gothic"/>
-        </w:rPr>
       </w:pPr>
       <w:r>
         <w:rPr>
-          <w:rFonts w:ascii="Century Gothic" w:hAnsi="Century Gothic"/>
           <w:b/>
         </w:rPr>
         <w:t>{{role}}</w:t>
@@ -261,14 +198,8 @@
       <w:pPr>
         <w:keepNext/>
         <w:spacing w:after="0" w:line="240" w:lineRule="auto"/>
-        <w:rPr>
-          <w:rFonts w:ascii="Century Gothic" w:hAnsi="Century Gothic"/>
-        </w:rPr>
       </w:pPr>
       <w:r>
-        <w:rPr>
-          <w:rFonts w:ascii="Century Gothic" w:hAnsi="Century Gothic"/>
-        </w:rPr>
         <w:t>{{employer}}</w:t>
       </w:r>
     </w:p>
@@ -276,14 +207,9 @@
       <w:pPr>
         <w:keepNext/>
         <w:spacing w:after="0" w:line="240" w:lineRule="auto"/>
-        <w:rPr>
-          <w:rFonts w:ascii="Century Gothic" w:hAnsi="Century Gothic"/>
-        </w:rPr>
       </w:pPr>
       <w:r>
         <w:rPr>
-          <w:rFonts w:ascii="Century Gothic" w:hAnsi="Century Gothic"/>
-          <w:b/>
           <w:u w:val="single"/>
         </w:rPr>
         <w:t>{{responsibilities}}</w:t>
@@ -291,35 +217,81 @@
     </w:p>
     <w:p>
       <w:pPr>
+        <w:pStyle w:val="ListParagraph"/>
         <w:keepLines/>
         <w:numPr>
           <w:ilvl w:val="0"/>
-          <w:numId w:val="1"/>
+          <w:numId w:val="9"/>
         </w:numPr>
-        <w:spacing w:after="0" w:line="240" w:lineRule="auto"/>
-        <w:ind w:left="567" w:hanging="387"/>
-        <w:rPr>
-          <w:rFonts w:ascii="Century Gothic" w:hAnsi="Century Gothic"/>
-        </w:rPr>
+        <w:spacing w:after="10" w:line="228" w:lineRule="auto"/>
       </w:pPr>
       <w:r>
-        <w:rPr>
-          <w:rFonts w:ascii="Century Gothic" w:hAnsi="Century Gothic"/>
-        </w:rPr>
+        <w:t>{{experience_bullet}}</w:t>
+      </w:r>
+    </w:p>
+    <w:p>
+      <w:pPr>
+        <w:pStyle w:val="ListParagraph"/>
+        <w:keepLines/>
+        <w:numPr>
+          <w:ilvl w:val="0"/>
+          <w:numId w:val="9"/>
+        </w:numPr>
+        <w:spacing w:after="10" w:line="228" w:lineRule="auto"/>
+      </w:pPr>
+      <w:r>
         <w:t>{{education_bullet}}</w:t>
       </w:r>
     </w:p>
     <w:p>
       <w:pPr>
+        <w:pStyle w:val="ListParagraph"/>
+        <w:keepLines/>
+        <w:numPr>
+          <w:ilvl w:val="0"/>
+          <w:numId w:val="9"/>
+        </w:numPr>
+        <w:spacing w:after="10" w:line="228" w:lineRule="auto"/>
+      </w:pPr>
+      <w:r>
+        <w:t>{{skill_bullet}}</w:t>
+      </w:r>
+    </w:p>
+    <w:p>
+      <w:pPr>
+        <w:pStyle w:val="ListParagraph"/>
+        <w:keepLines/>
+        <w:numPr>
+          <w:ilvl w:val="0"/>
+          <w:numId w:val="9"/>
+        </w:numPr>
+        <w:spacing w:after="10" w:line="228" w:lineRule="auto"/>
+      </w:pPr>
+      <w:r>
+        <w:t>{{certification_bullet}}</w:t>
+      </w:r>
+    </w:p>
+    <w:p>
+      <w:pPr>
+        <w:pStyle w:val="ListParagraph"/>
+        <w:keepLines/>
+        <w:numPr>
+          <w:ilvl w:val="0"/>
+          <w:numId w:val="9"/>
+        </w:numPr>
+        <w:spacing w:after="10" w:line="228" w:lineRule="auto"/>
+      </w:pPr>
+      <w:r>
+        <w:t>{{language_bullet}}</w:t>
+      </w:r>
+    </w:p>
+    <w:p>
+      <w:pPr>
         <w:keepNext/>
-        <w:spacing w:after="0" w:line="240" w:lineRule="auto"/>
-        <w:rPr>
-          <w:rFonts w:ascii="Century Gothic" w:hAnsi="Century Gothic"/>
-        </w:rPr>
+        <w:spacing w:before="60" w:after="0" w:line="240" w:lineRule="auto"/>
       </w:pPr>
       <w:r>
         <w:rPr>
-          <w:rFonts w:ascii="Century Gothic" w:hAnsi="Century Gothic"/>
           <w:b/>
         </w:rPr>
         <w:t>{{skill_category}}</w:t>
@@ -327,164 +299,21 @@
     </w:p>
     <w:p>
       <w:pPr>
-        <w:keepLines/>
-        <w:numPr>
-          <w:ilvl w:val="0"/>
-          <w:numId w:val="1"/>
-        </w:numPr>
-        <w:spacing w:after="0" w:line="240" w:lineRule="auto"/>
-        <w:ind w:left="567" w:hanging="387"/>
-        <w:rPr>
-          <w:rFonts w:ascii="Century Gothic" w:hAnsi="Century Gothic"/>
-        </w:rPr>
+        <w:spacing w:after="120" w:line="240" w:lineRule="auto"/>
+        <w:jc w:val="center"/>
       </w:pPr>
       <w:r>
         <w:rPr>
-          <w:rFonts w:ascii="Century Gothic" w:hAnsi="Century Gothic"/>
+          <w:b/>
+          <w:sz w:val="32"/>
         </w:rPr>
-        <w:t>{{skill_bullet}}</w:t>
-      </w:r>
-    </w:p>
-    <w:p>
-      <w:pPr>
-        <w:keepLines/>
-        <w:numPr>
-          <w:ilvl w:val="0"/>
-          <w:numId w:val="1"/>
-        </w:numPr>
-        <w:spacing w:after="0" w:line="240" w:lineRule="auto"/>
-        <w:ind w:left="567" w:hanging="387"/>
-        <w:rPr>
-          <w:rFonts w:ascii="Century Gothic" w:hAnsi="Century Gothic"/>
-        </w:rPr>
-      </w:pPr>
-      <w:r>
-        <w:rPr>
-          <w:rFonts w:ascii="Century Gothic" w:hAnsi="Century Gothic"/>
-        </w:rPr>
-        <w:t>{{certification_bullet}}</w:t>
-      </w:r>
-    </w:p>
-    <w:p>
-      <w:pPr>
-        <w:keepLines/>
-        <w:numPr>
-          <w:ilvl w:val="0"/>
-          <w:numId w:val="1"/>
-        </w:numPr>
-        <w:spacing w:after="0" w:line="240" w:lineRule="auto"/>
-        <w:ind w:left="567" w:hanging="387"/>
-        <w:rPr>
-          <w:rFonts w:ascii="Century Gothic" w:hAnsi="Century Gothic"/>
-        </w:rPr>
-      </w:pPr>
-      <w:r>
-        <w:rPr>
-          <w:rFonts w:ascii="Century Gothic" w:hAnsi="Century Gothic"/>
-        </w:rPr>
-        <w:t>{{language_bullet}}</w:t>
-      </w:r>
-    </w:p>
-    <w:p>
-      <w:pPr>
-        <w:keepNext/>
-        <w:spacing w:after="0" w:line="240" w:lineRule="auto"/>
-        <w:rPr>
-          <w:rFonts w:ascii="Century Gothic" w:hAnsi="Century Gothic"/>
-          <w:b/>
-          <w:color w:val="00665E"/>
-          <w:sz w:val="26"/>
-        </w:rPr>
-      </w:pPr>
-      <w:r>
-        <w:rPr>
-          <w:rFonts w:ascii="Century Gothic" w:hAnsi="Century Gothic"/>
-          <w:b/>
-          <w:color w:val="00665E"/>
-          <w:sz w:val="26"/>
-        </w:rPr>
-        <w:t>WORK EXPERIENCE</w:t>
-      </w:r>
-    </w:p>
-    <w:p>
-      <w:pPr>
-        <w:keepNext/>
-        <w:spacing w:after="0" w:line="240" w:lineRule="auto"/>
-        <w:rPr>
-          <w:rFonts w:ascii="Century Gothic" w:hAnsi="Century Gothic"/>
-          <w:b/>
-          <w:color w:val="00665E"/>
-          <w:sz w:val="26"/>
-        </w:rPr>
-      </w:pPr>
-      <w:r>
-        <w:rPr>
-          <w:rFonts w:ascii="Century Gothic" w:hAnsi="Century Gothic"/>
-          <w:b/>
-          <w:color w:val="00665E"/>
-          <w:sz w:val="26"/>
-        </w:rPr>
-        <w:t>EDUCATION</w:t>
-      </w:r>
-    </w:p>
-    <w:p>
-      <w:pPr>
-        <w:keepNext/>
-        <w:spacing w:after="0" w:line="240" w:lineRule="auto"/>
-        <w:rPr>
-          <w:rFonts w:ascii="Century Gothic" w:hAnsi="Century Gothic"/>
-        </w:rPr>
-      </w:pPr>
-      <w:r>
-        <w:rPr>
-          <w:rFonts w:ascii="Century Gothic" w:hAnsi="Century Gothic"/>
-          <w:b/>
-          <w:color w:val="00665E"/>
-          <w:sz w:val="26"/>
-        </w:rPr>
-        <w:t>IT SKILLS</w:t>
-      </w:r>
-    </w:p>
-    <w:p>
-      <w:pPr>
-        <w:keepNext/>
-        <w:spacing w:after="0" w:line="240" w:lineRule="auto"/>
-        <w:rPr>
-          <w:rFonts w:ascii="Century Gothic" w:hAnsi="Century Gothic"/>
-        </w:rPr>
-      </w:pPr>
-      <w:r>
-        <w:rPr>
-          <w:rFonts w:ascii="Century Gothic" w:hAnsi="Century Gothic"/>
-          <w:b/>
-          <w:color w:val="00665E"/>
-          <w:sz w:val="26"/>
-        </w:rPr>
-        <w:t>CERTIFICATIONS AND TRAINING</w:t>
-      </w:r>
-    </w:p>
-    <w:p>
-      <w:pPr>
-        <w:keepNext/>
-        <w:spacing w:after="0" w:line="240" w:lineRule="auto"/>
-        <w:rPr>
-          <w:rFonts w:ascii="Century Gothic" w:hAnsi="Century Gothic"/>
-        </w:rPr>
-      </w:pPr>
-      <w:r>
-        <w:rPr>
-          <w:rFonts w:ascii="Century Gothic" w:hAnsi="Century Gothic"/>
-          <w:b/>
-          <w:color w:val="00665E"/>
-          <w:sz w:val="26"/>
-        </w:rPr>
-        <w:t>LANGUAGES</w:t>
+        <w:t>{{layout_rr_afr_v1}}</w:t>
       </w:r>
     </w:p>
     <w:sectPr>
-      <w:pgSz w:w="12240" w:h="15840"/>
-      <w:pgMar w:top="648" w:right="792" w:bottom="648" w:left="792" w:header="720" w:footer="720" w:gutter="0"/>
-      <w:cols w:space="720"/>
+      <w:pgSz w:w="11906" w:h="16838"/>
+      <w:pgMar w:top="1440" w:right="1274" w:bottom="1276" w:left="1440" w:header="708" w:footer="708" w:gutter="0"/>
+      <w:cols w:space="708"/>
       <w:docGrid w:linePitch="360"/>
     </w:sectPr>
   </w:body>
@@ -534,6 +363,7 @@
     <w:lvl w:ilvl="0">
       <w:start w:val="1"/>
       <w:numFmt w:val="decimal"/>
+      <w:pStyle w:val="ListNumber3"/>
       <w:lvlText w:val="%1."/>
       <w:lvlJc w:val="left"/>
       <w:pPr>
@@ -551,6 +381,7 @@
     <w:lvl w:ilvl="0">
       <w:start w:val="1"/>
       <w:numFmt w:val="decimal"/>
+      <w:pStyle w:val="ListNumber2"/>
       <w:lvlText w:val="%1."/>
       <w:lvlJc w:val="left"/>
       <w:pPr>
@@ -588,6 +419,7 @@
     <w:lvl w:ilvl="0">
       <w:start w:val="1"/>
       <w:numFmt w:val="bullet"/>
+      <w:pStyle w:val="ListBullet3"/>
       <w:lvlText w:val=""/>
       <w:lvlJc w:val="left"/>
       <w:pPr>
@@ -608,6 +440,7 @@
     <w:lvl w:ilvl="0">
       <w:start w:val="1"/>
       <w:numFmt w:val="bullet"/>
+      <w:pStyle w:val="ListBullet2"/>
       <w:lvlText w:val=""/>
       <w:lvlJc w:val="left"/>
       <w:pPr>
@@ -628,6 +461,7 @@
     <w:lvl w:ilvl="0">
       <w:start w:val="1"/>
       <w:numFmt w:val="decimal"/>
+      <w:pStyle w:val="ListNumber"/>
       <w:lvlText w:val="%1."/>
       <w:lvlJc w:val="left"/>
       <w:pPr>
@@ -645,6 +479,7 @@
     <w:lvl w:ilvl="0">
       <w:start w:val="1"/>
       <w:numFmt w:val="bullet"/>
+      <w:pStyle w:val="ListBullet"/>
       <w:lvlText w:val=""/>
       <w:lvlJc w:val="left"/>
       <w:pPr>
@@ -659,79 +494,262 @@
     </w:lvl>
   </w:abstractNum>
   <w:abstractNum w:abstractNumId="9" w15:restartNumberingAfterBreak="0">
-    <w:nsid w:val="15BB6701"/>
+    <w:nsid w:val="57536287"/>
     <w:multiLevelType w:val="hybridMultilevel"/>
-    <w:tmpl w:val="883E410A"/>
-    <w:lvl w:ilvl="0" w:tplc="766C993C">
+    <w:tmpl w:val="F1B8AD7C"/>
+    <w:lvl w:ilvl="0" w:tplc="2ED4FFA4">
+      <w:numFmt w:val="bullet"/>
+      <w:lvlText w:val="•"/>
+      <w:lvlJc w:val="left"/>
+      <w:pPr>
+        <w:ind w:left="720" w:hanging="360"/>
+      </w:pPr>
+      <w:rPr>
+        <w:rFonts w:ascii="Century Gothic" w:eastAsia="Twentieth Century" w:hAnsi="Century Gothic" w:cstheme="minorBidi" w:hint="default"/>
+      </w:rPr>
+    </w:lvl>
+    <w:lvl w:ilvl="1" w:tplc="04100003" w:tentative="1">
       <w:start w:val="1"/>
       <w:numFmt w:val="bullet"/>
-      <w:pStyle w:val="ListBullet"/>
-      <w:lvlText w:val="▪"/>
+      <w:lvlText w:val="o"/>
       <w:lvlJc w:val="left"/>
       <w:pPr>
-        <w:ind w:left="360" w:hanging="180"/>
+        <w:ind w:left="1440" w:hanging="360"/>
       </w:pPr>
       <w:rPr>
-        <w:rFonts w:ascii="Tw Cen MT" w:hAnsi="Tw Cen MT"/>
+        <w:rFonts w:ascii="Courier New" w:hAnsi="Courier New" w:cs="Courier New" w:hint="default"/>
       </w:rPr>
     </w:lvl>
-    <w:lvl w:ilvl="1" w:tplc="766C993C">
+    <w:lvl w:ilvl="2" w:tplc="04100005" w:tentative="1">
       <w:start w:val="1"/>
       <w:numFmt w:val="bullet"/>
-      <w:lvlText w:val="▪"/>
+      <w:lvlText w:val=""/>
       <w:lvlJc w:val="left"/>
       <w:pPr>
-        <w:ind w:left="720" w:hanging="180"/>
+        <w:ind w:left="2160" w:hanging="360"/>
       </w:pPr>
       <w:rPr>
-        <w:rFonts w:ascii="Tw Cen MT" w:hAnsi="Tw Cen MT"/>
+        <w:rFonts w:ascii="Wingdings" w:hAnsi="Wingdings" w:hint="default"/>
       </w:rPr>
     </w:lvl>
-    <w:lvl w:ilvl="2" w:tplc="17EAE684">
+    <w:lvl w:ilvl="3" w:tplc="04100001" w:tentative="1">
       <w:start w:val="1"/>
       <w:numFmt w:val="bullet"/>
-      <w:lvlText w:val="▪"/>
+      <w:lvlText w:val=""/>
       <w:lvlJc w:val="left"/>
       <w:pPr>
-        <w:ind w:left="1080" w:hanging="180"/>
+        <w:ind w:left="2880" w:hanging="360"/>
       </w:pPr>
       <w:rPr>
-        <w:rFonts w:ascii="Tw Cen MT" w:hAnsi="Tw Cen MT"/>
+        <w:rFonts w:ascii="Symbol" w:hAnsi="Symbol" w:hint="default"/>
       </w:rPr>
     </w:lvl>
-    <w:lvl w:ilvl="3" w:tplc="1A8A8D48">
-      <w:numFmt w:val="decimal"/>
-      <w:lvlText w:val=""/>
+    <w:lvl w:ilvl="4" w:tplc="04100003" w:tentative="1">
+      <w:start w:val="1"/>
+      <w:numFmt w:val="bullet"/>
+      <w:lvlText w:val="o"/>
       <w:lvlJc w:val="left"/>
+      <w:pPr>
+        <w:ind w:left="3600" w:hanging="360"/>
+      </w:pPr>
+      <w:rPr>
+        <w:rFonts w:ascii="Courier New" w:hAnsi="Courier New" w:cs="Courier New" w:hint="default"/>
+      </w:rPr>
     </w:lvl>
-    <w:lvl w:ilvl="4" w:tplc="80002226">
-      <w:numFmt w:val="decimal"/>
-      <w:lvlText w:val=""/>
+    <w:lvl w:ilvl="5" w:tplc="04100005" w:tentative="1">
+      <w:start w:val="1"/>
+      <w:numFmt w:val="bullet"/>
+      <w:lvlText w:val=""/>
       <w:lvlJc w:val="left"/>
+      <w:pPr>
+        <w:ind w:left="4320" w:hanging="360"/>
+      </w:pPr>
+      <w:rPr>
+        <w:rFonts w:ascii="Wingdings" w:hAnsi="Wingdings" w:hint="default"/>
+      </w:rPr>
     </w:lvl>
-    <w:lvl w:ilvl="5" w:tplc="7546A328">
-      <w:numFmt w:val="decimal"/>
-      <w:lvlText w:val=""/>
+    <w:lvl w:ilvl="6" w:tplc="04100001" w:tentative="1">
+      <w:start w:val="1"/>
+      <w:numFmt w:val="bullet"/>
+      <w:lvlText w:val=""/>
       <w:lvlJc w:val="left"/>
+      <w:pPr>
+        <w:ind w:left="5040" w:hanging="360"/>
+      </w:pPr>
+      <w:rPr>
+        <w:rFonts w:ascii="Symbol" w:hAnsi="Symbol" w:hint="default"/>
+      </w:rPr>
     </w:lvl>
-    <w:lvl w:ilvl="6" w:tplc="AB4E6BFC">
-      <w:numFmt w:val="decimal"/>
-      <w:lvlText w:val=""/>
+    <w:lvl w:ilvl="7" w:tplc="04100003" w:tentative="1">
+      <w:start w:val="1"/>
+      <w:numFmt w:val="bullet"/>
+      <w:lvlText w:val="o"/>
       <w:lvlJc w:val="left"/>
+      <w:pPr>
+        <w:ind w:left="5760" w:hanging="360"/>
+      </w:pPr>
+      <w:rPr>
+        <w:rFonts w:ascii="Courier New" w:hAnsi="Courier New" w:cs="Courier New" w:hint="default"/>
+      </w:rPr>
     </w:lvl>
-    <w:lvl w:ilvl="7" w:tplc="3DD8044A">
-      <w:numFmt w:val="decimal"/>
-      <w:lvlText w:val=""/>
+    <w:lvl w:ilvl="8" w:tplc="04100005" w:tentative="1">
+      <w:start w:val="1"/>
+      <w:numFmt w:val="bullet"/>
+      <w:lvlText w:val=""/>
       <w:lvlJc w:val="left"/>
-    </w:lvl>
-    <w:lvl w:ilvl="8" w:tplc="00A28DF0">
-      <w:numFmt w:val="decimal"/>
-      <w:lvlText w:val=""/>
-      <w:lvlJc w:val="left"/>
+      <w:pPr>
+        <w:ind w:left="6480" w:hanging="360"/>
+      </w:pPr>
+      <w:rPr>
+        <w:rFonts w:ascii="Wingdings" w:hAnsi="Wingdings" w:hint="default"/>
+      </w:rPr>
     </w:lvl>
   </w:abstractNum>
-  <w:num w:numId="1" w16cid:durableId="521827007">
+  <w:abstractNum w:abstractNumId="10" w15:restartNumberingAfterBreak="0">
+    <w:nsid w:val="5C806ACD"/>
+    <w:multiLevelType w:val="hybridMultilevel"/>
+    <w:tmpl w:val="FEAE12C0"/>
+    <w:lvl w:ilvl="0" w:tplc="04100005">
+      <w:start w:val="1"/>
+      <w:numFmt w:val="bullet"/>
+      <w:lvlText w:val=""/>
+      <w:lvlJc w:val="left"/>
+      <w:pPr>
+        <w:ind w:left="360" w:hanging="360"/>
+      </w:pPr>
+      <w:rPr>
+        <w:rFonts w:ascii="Wingdings" w:hAnsi="Wingdings" w:hint="default"/>
+      </w:rPr>
+    </w:lvl>
+    <w:lvl w:ilvl="1" w:tplc="04100003" w:tentative="1">
+      <w:start w:val="1"/>
+      <w:numFmt w:val="bullet"/>
+      <w:lvlText w:val="o"/>
+      <w:lvlJc w:val="left"/>
+      <w:pPr>
+        <w:ind w:left="1080" w:hanging="360"/>
+      </w:pPr>
+      <w:rPr>
+        <w:rFonts w:ascii="Courier New" w:hAnsi="Courier New" w:cs="Courier New" w:hint="default"/>
+      </w:rPr>
+    </w:lvl>
+    <w:lvl w:ilvl="2" w:tplc="04100005" w:tentative="1">
+      <w:start w:val="1"/>
+      <w:numFmt w:val="bullet"/>
+      <w:lvlText w:val=""/>
+      <w:lvlJc w:val="left"/>
+      <w:pPr>
+        <w:ind w:left="1800" w:hanging="360"/>
+      </w:pPr>
+      <w:rPr>
+        <w:rFonts w:ascii="Wingdings" w:hAnsi="Wingdings" w:hint="default"/>
+      </w:rPr>
+    </w:lvl>
+    <w:lvl w:ilvl="3" w:tplc="04100001" w:tentative="1">
+      <w:start w:val="1"/>
+      <w:numFmt w:val="bullet"/>
+      <w:lvlText w:val=""/>
+      <w:lvlJc w:val="left"/>
+      <w:pPr>
+        <w:ind w:left="2520" w:hanging="360"/>
+      </w:pPr>
+      <w:rPr>
+        <w:rFonts w:ascii="Symbol" w:hAnsi="Symbol" w:hint="default"/>
+      </w:rPr>
+    </w:lvl>
+    <w:lvl w:ilvl="4" w:tplc="04100003" w:tentative="1">
+      <w:start w:val="1"/>
+      <w:numFmt w:val="bullet"/>
+      <w:lvlText w:val="o"/>
+      <w:lvlJc w:val="left"/>
+      <w:pPr>
+        <w:ind w:left="3240" w:hanging="360"/>
+      </w:pPr>
+      <w:rPr>
+        <w:rFonts w:ascii="Courier New" w:hAnsi="Courier New" w:cs="Courier New" w:hint="default"/>
+      </w:rPr>
+    </w:lvl>
+    <w:lvl w:ilvl="5" w:tplc="04100005" w:tentative="1">
+      <w:start w:val="1"/>
+      <w:numFmt w:val="bullet"/>
+      <w:lvlText w:val=""/>
+      <w:lvlJc w:val="left"/>
+      <w:pPr>
+        <w:ind w:left="3960" w:hanging="360"/>
+      </w:pPr>
+      <w:rPr>
+        <w:rFonts w:ascii="Wingdings" w:hAnsi="Wingdings" w:hint="default"/>
+      </w:rPr>
+    </w:lvl>
+    <w:lvl w:ilvl="6" w:tplc="04100001" w:tentative="1">
+      <w:start w:val="1"/>
+      <w:numFmt w:val="bullet"/>
+      <w:lvlText w:val=""/>
+      <w:lvlJc w:val="left"/>
+      <w:pPr>
+        <w:ind w:left="4680" w:hanging="360"/>
+      </w:pPr>
+      <w:rPr>
+        <w:rFonts w:ascii="Symbol" w:hAnsi="Symbol" w:hint="default"/>
+      </w:rPr>
+    </w:lvl>
+    <w:lvl w:ilvl="7" w:tplc="04100003" w:tentative="1">
+      <w:start w:val="1"/>
+      <w:numFmt w:val="bullet"/>
+      <w:lvlText w:val="o"/>
+      <w:lvlJc w:val="left"/>
+      <w:pPr>
+        <w:ind w:left="5400" w:hanging="360"/>
+      </w:pPr>
+      <w:rPr>
+        <w:rFonts w:ascii="Courier New" w:hAnsi="Courier New" w:cs="Courier New" w:hint="default"/>
+      </w:rPr>
+    </w:lvl>
+    <w:lvl w:ilvl="8" w:tplc="04100005" w:tentative="1">
+      <w:start w:val="1"/>
+      <w:numFmt w:val="bullet"/>
+      <w:lvlText w:val=""/>
+      <w:lvlJc w:val="left"/>
+      <w:pPr>
+        <w:ind w:left="6120" w:hanging="360"/>
+      </w:pPr>
+      <w:rPr>
+        <w:rFonts w:ascii="Wingdings" w:hAnsi="Wingdings" w:hint="default"/>
+      </w:rPr>
+    </w:lvl>
+  </w:abstractNum>
+  <w:num w:numId="1" w16cid:durableId="1322153592">
+    <w:abstractNumId w:val="5"/>
+  </w:num>
+  <w:num w:numId="2" w16cid:durableId="1895508615">
+    <w:abstractNumId w:val="2"/>
+  </w:num>
+  <w:num w:numId="3" w16cid:durableId="1924944858">
+    <w:abstractNumId w:val="8"/>
+  </w:num>
+  <w:num w:numId="4" w16cid:durableId="2060981625">
+    <w:abstractNumId w:val="1"/>
+  </w:num>
+  <w:num w:numId="5" w16cid:durableId="2135127965">
+    <w:abstractNumId w:val="3"/>
+  </w:num>
+  <w:num w:numId="6" w16cid:durableId="318964103">
+    <w:abstractNumId w:val="6"/>
+  </w:num>
+  <w:num w:numId="7" w16cid:durableId="387611739">
+    <w:abstractNumId w:val="4"/>
+  </w:num>
+  <w:num w:numId="8" w16cid:durableId="546526117">
     <w:abstractNumId w:val="9"/>
+  </w:num>
+  <w:num w:numId="9" w16cid:durableId="640158705">
+    <w:abstractNumId w:val="10"/>
+  </w:num>
+  <w:num w:numId="10" w16cid:durableId="938871999">
+    <w:abstractNumId w:val="7"/>
+  </w:num>
+  <w:num w:numId="11" w16cid:durableId="97333687">
+    <w:abstractNumId w:val="0"/>
   </w:num>
 </w:numbering>
 </file>
@@ -1127,7 +1145,7 @@
     <w:qFormat/>
     <w:rsid w:val="00FC693F"/>
     <w:rPr>
-      <w:rFonts w:ascii="Twentieth Century" w:eastAsia="Twentieth Century" w:hAnsi="Twentieth Century"/>
+      <w:rFonts w:ascii="Century Gothic" w:eastAsia="Century Gothic" w:hAnsi="Century Gothic"/>
     </w:rPr>
   </w:style>
   <w:style w:type="paragraph" w:styleId="Heading1">
@@ -1310,6 +1328,7 @@
     <w:rPr>
       <w:rFonts w:asciiTheme="majorHAnsi" w:eastAsiaTheme="majorEastAsia" w:hAnsiTheme="majorHAnsi" w:cstheme="majorBidi"/>
       <w:color w:val="4F81BD" w:themeColor="accent1"/>
+      <w:sz w:val="20"/>
       <w:szCs w:val="20"/>
     </w:rPr>
   </w:style>
@@ -1334,12 +1353,14 @@
       <w:i/>
       <w:iCs/>
       <w:color w:val="404040" w:themeColor="text1" w:themeTint="BF"/>
+      <w:sz w:val="20"/>
       <w:szCs w:val="20"/>
     </w:rPr>
   </w:style>
   <w:style w:type="character" w:default="1" w:styleId="DefaultParagraphFont">
     <w:name w:val="Default Paragraph Font"/>
     <w:uiPriority w:val="1"/>
+    <w:semiHidden/>
     <w:unhideWhenUsed/>
   </w:style>
   <w:style w:type="table" w:default="1" w:styleId="TableNormal">
@@ -1651,7 +1672,7 @@
     <w:rsid w:val="00326F90"/>
     <w:pPr>
       <w:numPr>
-        <w:numId w:val="1"/>
+        <w:numId w:val="3"/>
       </w:numPr>
       <w:contextualSpacing/>
     </w:pPr>
@@ -1663,9 +1684,9 @@
     <w:unhideWhenUsed/>
     <w:rsid w:val="00326F90"/>
     <w:pPr>
-      <w:tabs>
-        <w:tab w:val="num" w:pos="360"/>
-      </w:tabs>
+      <w:numPr>
+        <w:numId w:val="6"/>
+      </w:numPr>
       <w:contextualSpacing/>
     </w:pPr>
   </w:style>
@@ -1676,9 +1697,9 @@
     <w:unhideWhenUsed/>
     <w:rsid w:val="00326F90"/>
     <w:pPr>
-      <w:tabs>
-        <w:tab w:val="num" w:pos="360"/>
-      </w:tabs>
+      <w:numPr>
+        <w:numId w:val="1"/>
+      </w:numPr>
       <w:contextualSpacing/>
     </w:pPr>
   </w:style>
@@ -1689,9 +1710,9 @@
     <w:unhideWhenUsed/>
     <w:rsid w:val="00326F90"/>
     <w:pPr>
-      <w:tabs>
-        <w:tab w:val="num" w:pos="360"/>
-      </w:tabs>
+      <w:numPr>
+        <w:numId w:val="10"/>
+      </w:numPr>
       <w:contextualSpacing/>
     </w:pPr>
   </w:style>
@@ -1702,9 +1723,9 @@
     <w:unhideWhenUsed/>
     <w:rsid w:val="0029639D"/>
     <w:pPr>
-      <w:tabs>
-        <w:tab w:val="num" w:pos="360"/>
-      </w:tabs>
+      <w:numPr>
+        <w:numId w:val="5"/>
+      </w:numPr>
       <w:contextualSpacing/>
     </w:pPr>
   </w:style>
@@ -1715,9 +1736,9 @@
     <w:unhideWhenUsed/>
     <w:rsid w:val="0029639D"/>
     <w:pPr>
-      <w:tabs>
-        <w:tab w:val="num" w:pos="360"/>
-      </w:tabs>
+      <w:numPr>
+        <w:numId w:val="2"/>
+      </w:numPr>
       <w:contextualSpacing/>
     </w:pPr>
   </w:style>
@@ -12115,46 +12136,6 @@
         <w:shd w:val="clear" w:color="auto" w:fill="FBCAA2" w:themeFill="accent6" w:themeFillTint="7F"/>
       </w:tcPr>
     </w:tblStylePr>
-  </w:style>
-  <w:style w:type="paragraph" w:customStyle="1" w:styleId="BTOSectionHeading">
-    <w:name w:val="BTO Section Heading"/>
-    <w:rPr>
-      <w:rFonts w:ascii="Tw Cen MT" w:eastAsia="Tw Cen MT" w:hAnsi="Tw Cen MT"/>
-      <w:b/>
-      <w:color w:val="007364"/>
-      <w:sz w:val="32"/>
-    </w:rPr>
-  </w:style>
-  <w:style w:type="paragraph" w:customStyle="1" w:styleId="BTODate">
-    <w:name w:val="BTO Date"/>
-    <w:rPr>
-      <w:rFonts w:ascii="Tw Cen MT" w:eastAsia="Tw Cen MT" w:hAnsi="Tw Cen MT"/>
-      <w:b/>
-      <w:sz w:val="21"/>
-    </w:rPr>
-  </w:style>
-  <w:style w:type="paragraph" w:customStyle="1" w:styleId="BTORole">
-    <w:name w:val="BTO Role"/>
-    <w:rPr>
-      <w:rFonts w:ascii="Tw Cen MT" w:eastAsia="Tw Cen MT" w:hAnsi="Tw Cen MT"/>
-      <w:b/>
-      <w:sz w:val="21"/>
-    </w:rPr>
-  </w:style>
-  <w:style w:type="paragraph" w:customStyle="1" w:styleId="BTOCompany">
-    <w:name w:val="BTO Company"/>
-    <w:rPr>
-      <w:rFonts w:ascii="Tw Cen MT" w:eastAsia="Tw Cen MT" w:hAnsi="Tw Cen MT"/>
-      <w:sz w:val="21"/>
-    </w:rPr>
-  </w:style>
-  <w:style w:type="paragraph" w:customStyle="1" w:styleId="BTOSkillHeading">
-    <w:name w:val="BTO Skill Heading"/>
-    <w:rPr>
-      <w:rFonts w:ascii="Tw Cen MT" w:eastAsia="Tw Cen MT" w:hAnsi="Tw Cen MT"/>
-      <w:b/>
-      <w:sz w:val="21"/>
-    </w:rPr>
   </w:style>
 </w:styles>
 </file>

</xml_diff>

<commit_message>
Match R.R./A.F.R. Word layout and validate native square lists (#1)
</commit_message>
<xml_diff>
--- a/skills/bto-cv/assets/BTO_CV_Template.docx
+++ b/skills/bto-cv/assets/BTO_CV_Template.docx
@@ -4,22 +4,25 @@
   <w:body>
     <w:p>
       <w:pPr>
-        <w:ind w:left="426" w:hanging="284"/>
+        <w:spacing w:after="180"/>
+        <w:ind w:hanging="284"/>
         <w:jc w:val="center"/>
-        <w:rPr>
-          <w:rFonts w:ascii="Century Gothic" w:hAnsi="Century Gothic"/>
-        </w:rPr>
       </w:pPr>
       <w:r>
         <w:rPr>
-          <w:rFonts w:ascii="Century Gothic" w:hAnsi="Century Gothic"/>
           <w:noProof/>
         </w:rPr>
         <w:drawing>
-          <wp:inline distT="0" distB="0" distL="0" distR="0" wp14:anchorId="37BD356C" wp14:editId="70B74B92">
-            <wp:extent cx="6126480" cy="783386"/>
+          <wp:inline distT="0" distB="0" distL="0" distR="0" wp14:anchorId="31FBBCC0" wp14:editId="2184D20A">
+            <wp:extent cx="6172200" cy="789232"/>
             <wp:effectExtent l="0" t="0" r="0" b="0"/>
-            <wp:docPr id="1" name="Picture 1"/>
+            <wp:docPr id="1" name="Picture 1">
+              <a:extLst xmlns:a="http://schemas.openxmlformats.org/drawingml/2006/main">
+                <a:ext uri="{FF2B5EF4-FFF2-40B4-BE49-F238E27FC236}">
+                  <a16:creationId xmlns:a16="http://schemas.microsoft.com/office/drawing/2014/main" id="{CABBAD04-59CB-4B59-99AE-22D7CA434CDB}"/>
+                </a:ext>
+              </a:extLst>
+            </wp:docPr>
             <wp:cNvGraphicFramePr>
               <a:graphicFrameLocks xmlns:a="http://schemas.openxmlformats.org/drawingml/2006/main" noChangeAspect="1"/>
             </wp:cNvGraphicFramePr>
@@ -39,7 +42,7 @@
                   <pic:spPr>
                     <a:xfrm>
                       <a:off x="0" y="0"/>
-                      <a:ext cx="6126480" cy="783386"/>
+                      <a:ext cx="6172200" cy="789232"/>
                     </a:xfrm>
                     <a:prstGeom prst="rect">
                       <a:avLst/>
@@ -54,15 +57,11 @@
     </w:p>
     <w:p>
       <w:pPr>
-        <w:spacing w:after="0" w:line="240" w:lineRule="auto"/>
+        <w:spacing w:after="120" w:line="240" w:lineRule="auto"/>
         <w:jc w:val="center"/>
-        <w:rPr>
-          <w:rFonts w:ascii="Century Gothic" w:hAnsi="Century Gothic"/>
-        </w:rPr>
       </w:pPr>
       <w:r>
         <w:rPr>
-          <w:rFonts w:ascii="Century Gothic" w:hAnsi="Century Gothic"/>
           <w:b/>
           <w:sz w:val="32"/>
         </w:rPr>
@@ -71,171 +70,113 @@
     </w:p>
     <w:p>
       <w:pPr>
-        <w:spacing w:after="0" w:line="240" w:lineRule="auto"/>
-        <w:rPr>
-          <w:rFonts w:ascii="Century Gothic" w:hAnsi="Century Gothic"/>
-        </w:rPr>
+        <w:keepNext/>
+        <w:spacing w:before="110" w:after="80" w:line="240" w:lineRule="auto"/>
       </w:pPr>
       <w:r>
-        <w:t>{{gap}}</w:t>
+        <w:rPr>
+          <w:b/>
+          <w:color w:val="00665F"/>
+          <w:sz w:val="26"/>
+        </w:rPr>
+        <w:t>WORK EXPERIENCE</w:t>
+      </w:r>
+    </w:p>
+    <w:p>
+      <w:pPr>
+        <w:keepNext/>
+        <w:spacing w:before="110" w:after="80" w:line="240" w:lineRule="auto"/>
+      </w:pPr>
+      <w:r>
+        <w:rPr>
+          <w:b/>
+          <w:color w:val="00665F"/>
+          <w:sz w:val="26"/>
+        </w:rPr>
+        <w:t>E</w:t>
+      </w:r>
+      <w:r>
+        <w:rPr>
+          <w:b/>
+          <w:color w:val="00665F"/>
+          <w:sz w:val="26"/>
+        </w:rPr>
+        <w:t>DUCATION</w:t>
+      </w:r>
+    </w:p>
+    <w:p>
+      <w:pPr>
+        <w:keepNext/>
+        <w:spacing w:before="110" w:after="80" w:line="240" w:lineRule="auto"/>
+      </w:pPr>
+      <w:r>
+        <w:rPr>
+          <w:b/>
+          <w:color w:val="00665F"/>
+          <w:sz w:val="26"/>
+        </w:rPr>
+        <w:t>I</w:t>
+      </w:r>
+      <w:r>
+        <w:rPr>
+          <w:b/>
+          <w:color w:val="00665F"/>
+          <w:sz w:val="26"/>
+        </w:rPr>
+        <w:t>T SKILLS</w:t>
+      </w:r>
+    </w:p>
+    <w:p>
+      <w:pPr>
+        <w:keepNext/>
+        <w:spacing w:before="110" w:after="80" w:line="240" w:lineRule="auto"/>
+      </w:pPr>
+      <w:r>
+        <w:rPr>
+          <w:b/>
+          <w:color w:val="00665F"/>
+          <w:sz w:val="26"/>
+        </w:rPr>
+        <w:t>C</w:t>
+      </w:r>
+      <w:r>
+        <w:rPr>
+          <w:b/>
+          <w:color w:val="00665F"/>
+          <w:sz w:val="26"/>
+        </w:rPr>
+        <w:t>ERTIFICATIONS AND TRAINING</w:t>
+      </w:r>
+    </w:p>
+    <w:p>
+      <w:pPr>
+        <w:keepNext/>
+        <w:spacing w:before="110" w:after="80" w:line="240" w:lineRule="auto"/>
+      </w:pPr>
+      <w:r>
+        <w:rPr>
+          <w:b/>
+          <w:color w:val="00665F"/>
+          <w:sz w:val="26"/>
+        </w:rPr>
+        <w:t>L</w:t>
+      </w:r>
+      <w:r>
+        <w:rPr>
+          <w:b/>
+          <w:color w:val="00665F"/>
+          <w:sz w:val="26"/>
+        </w:rPr>
+        <w:t>ANGUAGES</w:t>
       </w:r>
     </w:p>
     <w:p>
       <w:pPr>
         <w:keepNext/>
         <w:spacing w:after="0" w:line="240" w:lineRule="auto"/>
-        <w:rPr>
-          <w:rFonts w:ascii="Century Gothic" w:hAnsi="Century Gothic"/>
-          <w:b/>
-          <w:color w:val="00665E"/>
-          <w:sz w:val="26"/>
-        </w:rPr>
-      </w:pPr>
-      <w:r>
-        <w:t>{{heading_gap}}</w:t>
-      </w:r>
-    </w:p>
-    <w:p>
-      <w:pPr>
-        <w:keepLines/>
-        <w:spacing w:after="0" w:line="240" w:lineRule="auto"/>
-        <w:ind w:left="567"/>
-        <w:rPr>
-          <w:rFonts w:ascii="Century Gothic" w:hAnsi="Century Gothic"/>
-        </w:rPr>
-      </w:pPr>
-      <w:r>
-        <w:t>{{list_gap}}</w:t>
-      </w:r>
-    </w:p>
-    <w:p>
-      <w:pPr>
-        <w:keepNext/>
-        <w:spacing w:after="0" w:line="240" w:lineRule="auto"/>
-        <w:ind w:left="426" w:hanging="284"/>
-        <w:rPr>
-          <w:rFonts w:ascii="Century Gothic" w:hAnsi="Century Gothic"/>
-        </w:rPr>
       </w:pPr>
       <w:r>
         <w:rPr>
-          <w:rFonts w:ascii="Century Gothic" w:hAnsi="Century Gothic"/>
-          <w:b/>
-        </w:rPr>
-        <w:t>{{first_dates}}</w:t>
-      </w:r>
-    </w:p>
-    <w:p>
-      <w:pPr>
-        <w:keepNext/>
-        <w:spacing w:after="0" w:line="240" w:lineRule="auto"/>
-        <w:ind w:left="426" w:hanging="284"/>
-        <w:rPr>
-          <w:rFonts w:ascii="Century Gothic" w:hAnsi="Century Gothic"/>
-          <w:b/>
-        </w:rPr>
-      </w:pPr>
-      <w:r>
-        <w:rPr>
-          <w:rFonts w:ascii="Century Gothic" w:hAnsi="Century Gothic"/>
-          <w:b/>
-        </w:rPr>
-        <w:t>{{first_role}}</w:t>
-      </w:r>
-    </w:p>
-    <w:p>
-      <w:pPr>
-        <w:keepNext/>
-        <w:spacing w:after="0" w:line="240" w:lineRule="auto"/>
-        <w:ind w:left="426" w:hanging="284"/>
-        <w:rPr>
-          <w:rFonts w:ascii="Century Gothic" w:hAnsi="Century Gothic"/>
-        </w:rPr>
-      </w:pPr>
-      <w:r>
-        <w:rPr>
-          <w:rFonts w:ascii="Century Gothic" w:hAnsi="Century Gothic"/>
-        </w:rPr>
-        <w:t>{{first_employer}}</w:t>
-      </w:r>
-    </w:p>
-    <w:p>
-      <w:pPr>
-        <w:keepNext/>
-        <w:spacing w:after="0" w:line="240" w:lineRule="auto"/>
-        <w:ind w:left="426" w:hanging="284"/>
-        <w:rPr>
-          <w:rFonts w:ascii="Century Gothic" w:hAnsi="Century Gothic"/>
-          <w:b/>
-          <w:u w:val="single"/>
-        </w:rPr>
-      </w:pPr>
-      <w:r>
-        <w:rPr>
-          <w:rFonts w:ascii="Century Gothic" w:hAnsi="Century Gothic"/>
-          <w:b/>
-          <w:u w:val="single"/>
-        </w:rPr>
-        <w:t>{{first_responsibilities}}</w:t>
-      </w:r>
-    </w:p>
-    <w:p>
-      <w:pPr>
-        <w:keepLines/>
-        <w:numPr>
-          <w:ilvl w:val="0"/>
-          <w:numId w:val="1"/>
-        </w:numPr>
-        <w:spacing w:after="0" w:line="240" w:lineRule="auto"/>
-        <w:ind w:left="567" w:hanging="387"/>
-        <w:rPr>
-          <w:rFonts w:ascii="Century Gothic" w:hAnsi="Century Gothic"/>
-        </w:rPr>
-      </w:pPr>
-      <w:r>
-        <w:rPr>
-          <w:rFonts w:ascii="Century Gothic" w:hAnsi="Century Gothic"/>
-        </w:rPr>
-        <w:t>{{experience_bullet}}</w:t>
-      </w:r>
-    </w:p>
-    <w:p>
-      <w:pPr>
-        <w:keepLines/>
-        <w:numPr>
-          <w:ilvl w:val="0"/>
-          <w:numId w:val="1"/>
-        </w:numPr>
-        <w:spacing w:after="0" w:line="240" w:lineRule="auto"/>
-        <w:ind w:left="567" w:hanging="387"/>
-        <w:rPr>
-          <w:rFonts w:ascii="Century Gothic" w:hAnsi="Century Gothic"/>
-        </w:rPr>
-      </w:pPr>
-      <w:r>
-        <w:rPr>
-          <w:rFonts w:ascii="Century Gothic" w:hAnsi="Century Gothic"/>
-        </w:rPr>
-        <w:t>{{first_last_bullet}}</w:t>
-      </w:r>
-      <w:r>
-        <w:rPr>
-          <w:rFonts w:ascii="Century Gothic" w:hAnsi="Century Gothic"/>
-        </w:rPr>
-        <w:br/>
-      </w:r>
-    </w:p>
-    <w:p>
-      <w:pPr>
-        <w:keepNext/>
-        <w:spacing w:after="0" w:line="240" w:lineRule="auto"/>
-        <w:rPr>
-          <w:rFonts w:ascii="Century Gothic" w:hAnsi="Century Gothic"/>
-        </w:rPr>
-      </w:pPr>
-      <w:r>
-        <w:rPr>
-          <w:rFonts w:ascii="Century Gothic" w:hAnsi="Century Gothic"/>
           <w:b/>
         </w:rPr>
         <w:t>{{dates}}</w:t>
@@ -245,13 +186,9 @@
       <w:pPr>
         <w:keepNext/>
         <w:spacing w:after="0" w:line="240" w:lineRule="auto"/>
-        <w:rPr>
-          <w:rFonts w:ascii="Century Gothic" w:hAnsi="Century Gothic"/>
-        </w:rPr>
       </w:pPr>
       <w:r>
         <w:rPr>
-          <w:rFonts w:ascii="Century Gothic" w:hAnsi="Century Gothic"/>
           <w:b/>
         </w:rPr>
         <w:t>{{role}}</w:t>
@@ -261,14 +198,8 @@
       <w:pPr>
         <w:keepNext/>
         <w:spacing w:after="0" w:line="240" w:lineRule="auto"/>
-        <w:rPr>
-          <w:rFonts w:ascii="Century Gothic" w:hAnsi="Century Gothic"/>
-        </w:rPr>
       </w:pPr>
       <w:r>
-        <w:rPr>
-          <w:rFonts w:ascii="Century Gothic" w:hAnsi="Century Gothic"/>
-        </w:rPr>
         <w:t>{{employer}}</w:t>
       </w:r>
     </w:p>
@@ -276,14 +207,9 @@
       <w:pPr>
         <w:keepNext/>
         <w:spacing w:after="0" w:line="240" w:lineRule="auto"/>
-        <w:rPr>
-          <w:rFonts w:ascii="Century Gothic" w:hAnsi="Century Gothic"/>
-        </w:rPr>
       </w:pPr>
       <w:r>
         <w:rPr>
-          <w:rFonts w:ascii="Century Gothic" w:hAnsi="Century Gothic"/>
-          <w:b/>
           <w:u w:val="single"/>
         </w:rPr>
         <w:t>{{responsibilities}}</w:t>
@@ -291,35 +217,81 @@
     </w:p>
     <w:p>
       <w:pPr>
+        <w:pStyle w:val="ListParagraph"/>
         <w:keepLines/>
         <w:numPr>
           <w:ilvl w:val="0"/>
-          <w:numId w:val="1"/>
+          <w:numId w:val="9"/>
         </w:numPr>
-        <w:spacing w:after="0" w:line="240" w:lineRule="auto"/>
-        <w:ind w:left="567" w:hanging="387"/>
-        <w:rPr>
-          <w:rFonts w:ascii="Century Gothic" w:hAnsi="Century Gothic"/>
-        </w:rPr>
+        <w:spacing w:after="10" w:line="228" w:lineRule="auto"/>
       </w:pPr>
       <w:r>
-        <w:rPr>
-          <w:rFonts w:ascii="Century Gothic" w:hAnsi="Century Gothic"/>
-        </w:rPr>
+        <w:t>{{experience_bullet}}</w:t>
+      </w:r>
+    </w:p>
+    <w:p>
+      <w:pPr>
+        <w:pStyle w:val="ListParagraph"/>
+        <w:keepLines/>
+        <w:numPr>
+          <w:ilvl w:val="0"/>
+          <w:numId w:val="9"/>
+        </w:numPr>
+        <w:spacing w:after="10" w:line="228" w:lineRule="auto"/>
+      </w:pPr>
+      <w:r>
         <w:t>{{education_bullet}}</w:t>
       </w:r>
     </w:p>
     <w:p>
       <w:pPr>
+        <w:pStyle w:val="ListParagraph"/>
+        <w:keepLines/>
+        <w:numPr>
+          <w:ilvl w:val="0"/>
+          <w:numId w:val="9"/>
+        </w:numPr>
+        <w:spacing w:after="10" w:line="228" w:lineRule="auto"/>
+      </w:pPr>
+      <w:r>
+        <w:t>{{skill_bullet}}</w:t>
+      </w:r>
+    </w:p>
+    <w:p>
+      <w:pPr>
+        <w:pStyle w:val="ListParagraph"/>
+        <w:keepLines/>
+        <w:numPr>
+          <w:ilvl w:val="0"/>
+          <w:numId w:val="9"/>
+        </w:numPr>
+        <w:spacing w:after="10" w:line="228" w:lineRule="auto"/>
+      </w:pPr>
+      <w:r>
+        <w:t>{{certification_bullet}}</w:t>
+      </w:r>
+    </w:p>
+    <w:p>
+      <w:pPr>
+        <w:pStyle w:val="ListParagraph"/>
+        <w:keepLines/>
+        <w:numPr>
+          <w:ilvl w:val="0"/>
+          <w:numId w:val="9"/>
+        </w:numPr>
+        <w:spacing w:after="10" w:line="228" w:lineRule="auto"/>
+      </w:pPr>
+      <w:r>
+        <w:t>{{language_bullet}}</w:t>
+      </w:r>
+    </w:p>
+    <w:p>
+      <w:pPr>
         <w:keepNext/>
-        <w:spacing w:after="0" w:line="240" w:lineRule="auto"/>
-        <w:rPr>
-          <w:rFonts w:ascii="Century Gothic" w:hAnsi="Century Gothic"/>
-        </w:rPr>
+        <w:spacing w:before="60" w:after="0" w:line="240" w:lineRule="auto"/>
       </w:pPr>
       <w:r>
         <w:rPr>
-          <w:rFonts w:ascii="Century Gothic" w:hAnsi="Century Gothic"/>
           <w:b/>
         </w:rPr>
         <w:t>{{skill_category}}</w:t>
@@ -327,164 +299,21 @@
     </w:p>
     <w:p>
       <w:pPr>
-        <w:keepLines/>
-        <w:numPr>
-          <w:ilvl w:val="0"/>
-          <w:numId w:val="1"/>
-        </w:numPr>
-        <w:spacing w:after="0" w:line="240" w:lineRule="auto"/>
-        <w:ind w:left="567" w:hanging="387"/>
-        <w:rPr>
-          <w:rFonts w:ascii="Century Gothic" w:hAnsi="Century Gothic"/>
-        </w:rPr>
+        <w:spacing w:after="120" w:line="240" w:lineRule="auto"/>
+        <w:jc w:val="center"/>
       </w:pPr>
       <w:r>
         <w:rPr>
-          <w:rFonts w:ascii="Century Gothic" w:hAnsi="Century Gothic"/>
+          <w:b/>
+          <w:sz w:val="32"/>
         </w:rPr>
-        <w:t>{{skill_bullet}}</w:t>
-      </w:r>
-    </w:p>
-    <w:p>
-      <w:pPr>
-        <w:keepLines/>
-        <w:numPr>
-          <w:ilvl w:val="0"/>
-          <w:numId w:val="1"/>
-        </w:numPr>
-        <w:spacing w:after="0" w:line="240" w:lineRule="auto"/>
-        <w:ind w:left="567" w:hanging="387"/>
-        <w:rPr>
-          <w:rFonts w:ascii="Century Gothic" w:hAnsi="Century Gothic"/>
-        </w:rPr>
-      </w:pPr>
-      <w:r>
-        <w:rPr>
-          <w:rFonts w:ascii="Century Gothic" w:hAnsi="Century Gothic"/>
-        </w:rPr>
-        <w:t>{{certification_bullet}}</w:t>
-      </w:r>
-    </w:p>
-    <w:p>
-      <w:pPr>
-        <w:keepLines/>
-        <w:numPr>
-          <w:ilvl w:val="0"/>
-          <w:numId w:val="1"/>
-        </w:numPr>
-        <w:spacing w:after="0" w:line="240" w:lineRule="auto"/>
-        <w:ind w:left="567" w:hanging="387"/>
-        <w:rPr>
-          <w:rFonts w:ascii="Century Gothic" w:hAnsi="Century Gothic"/>
-        </w:rPr>
-      </w:pPr>
-      <w:r>
-        <w:rPr>
-          <w:rFonts w:ascii="Century Gothic" w:hAnsi="Century Gothic"/>
-        </w:rPr>
-        <w:t>{{language_bullet}}</w:t>
-      </w:r>
-    </w:p>
-    <w:p>
-      <w:pPr>
-        <w:keepNext/>
-        <w:spacing w:after="0" w:line="240" w:lineRule="auto"/>
-        <w:rPr>
-          <w:rFonts w:ascii="Century Gothic" w:hAnsi="Century Gothic"/>
-          <w:b/>
-          <w:color w:val="00665E"/>
-          <w:sz w:val="26"/>
-        </w:rPr>
-      </w:pPr>
-      <w:r>
-        <w:rPr>
-          <w:rFonts w:ascii="Century Gothic" w:hAnsi="Century Gothic"/>
-          <w:b/>
-          <w:color w:val="00665E"/>
-          <w:sz w:val="26"/>
-        </w:rPr>
-        <w:t>WORK EXPERIENCE</w:t>
-      </w:r>
-    </w:p>
-    <w:p>
-      <w:pPr>
-        <w:keepNext/>
-        <w:spacing w:after="0" w:line="240" w:lineRule="auto"/>
-        <w:rPr>
-          <w:rFonts w:ascii="Century Gothic" w:hAnsi="Century Gothic"/>
-          <w:b/>
-          <w:color w:val="00665E"/>
-          <w:sz w:val="26"/>
-        </w:rPr>
-      </w:pPr>
-      <w:r>
-        <w:rPr>
-          <w:rFonts w:ascii="Century Gothic" w:hAnsi="Century Gothic"/>
-          <w:b/>
-          <w:color w:val="00665E"/>
-          <w:sz w:val="26"/>
-        </w:rPr>
-        <w:t>EDUCATION</w:t>
-      </w:r>
-    </w:p>
-    <w:p>
-      <w:pPr>
-        <w:keepNext/>
-        <w:spacing w:after="0" w:line="240" w:lineRule="auto"/>
-        <w:rPr>
-          <w:rFonts w:ascii="Century Gothic" w:hAnsi="Century Gothic"/>
-        </w:rPr>
-      </w:pPr>
-      <w:r>
-        <w:rPr>
-          <w:rFonts w:ascii="Century Gothic" w:hAnsi="Century Gothic"/>
-          <w:b/>
-          <w:color w:val="00665E"/>
-          <w:sz w:val="26"/>
-        </w:rPr>
-        <w:t>IT SKILLS</w:t>
-      </w:r>
-    </w:p>
-    <w:p>
-      <w:pPr>
-        <w:keepNext/>
-        <w:spacing w:after="0" w:line="240" w:lineRule="auto"/>
-        <w:rPr>
-          <w:rFonts w:ascii="Century Gothic" w:hAnsi="Century Gothic"/>
-        </w:rPr>
-      </w:pPr>
-      <w:r>
-        <w:rPr>
-          <w:rFonts w:ascii="Century Gothic" w:hAnsi="Century Gothic"/>
-          <w:b/>
-          <w:color w:val="00665E"/>
-          <w:sz w:val="26"/>
-        </w:rPr>
-        <w:t>CERTIFICATIONS AND TRAINING</w:t>
-      </w:r>
-    </w:p>
-    <w:p>
-      <w:pPr>
-        <w:keepNext/>
-        <w:spacing w:after="0" w:line="240" w:lineRule="auto"/>
-        <w:rPr>
-          <w:rFonts w:ascii="Century Gothic" w:hAnsi="Century Gothic"/>
-        </w:rPr>
-      </w:pPr>
-      <w:r>
-        <w:rPr>
-          <w:rFonts w:ascii="Century Gothic" w:hAnsi="Century Gothic"/>
-          <w:b/>
-          <w:color w:val="00665E"/>
-          <w:sz w:val="26"/>
-        </w:rPr>
-        <w:t>LANGUAGES</w:t>
+        <w:t>{{layout_rr_afr_v1}}</w:t>
       </w:r>
     </w:p>
     <w:sectPr>
-      <w:pgSz w:w="12240" w:h="15840"/>
-      <w:pgMar w:top="648" w:right="792" w:bottom="648" w:left="792" w:header="720" w:footer="720" w:gutter="0"/>
-      <w:cols w:space="720"/>
+      <w:pgSz w:w="11906" w:h="16838"/>
+      <w:pgMar w:top="1440" w:right="1274" w:bottom="1276" w:left="1440" w:header="708" w:footer="708" w:gutter="0"/>
+      <w:cols w:space="708"/>
       <w:docGrid w:linePitch="360"/>
     </w:sectPr>
   </w:body>
@@ -534,6 +363,7 @@
     <w:lvl w:ilvl="0">
       <w:start w:val="1"/>
       <w:numFmt w:val="decimal"/>
+      <w:pStyle w:val="ListNumber3"/>
       <w:lvlText w:val="%1."/>
       <w:lvlJc w:val="left"/>
       <w:pPr>
@@ -551,6 +381,7 @@
     <w:lvl w:ilvl="0">
       <w:start w:val="1"/>
       <w:numFmt w:val="decimal"/>
+      <w:pStyle w:val="ListNumber2"/>
       <w:lvlText w:val="%1."/>
       <w:lvlJc w:val="left"/>
       <w:pPr>
@@ -588,6 +419,7 @@
     <w:lvl w:ilvl="0">
       <w:start w:val="1"/>
       <w:numFmt w:val="bullet"/>
+      <w:pStyle w:val="ListBullet3"/>
       <w:lvlText w:val=""/>
       <w:lvlJc w:val="left"/>
       <w:pPr>
@@ -608,6 +440,7 @@
     <w:lvl w:ilvl="0">
       <w:start w:val="1"/>
       <w:numFmt w:val="bullet"/>
+      <w:pStyle w:val="ListBullet2"/>
       <w:lvlText w:val=""/>
       <w:lvlJc w:val="left"/>
       <w:pPr>
@@ -628,6 +461,7 @@
     <w:lvl w:ilvl="0">
       <w:start w:val="1"/>
       <w:numFmt w:val="decimal"/>
+      <w:pStyle w:val="ListNumber"/>
       <w:lvlText w:val="%1."/>
       <w:lvlJc w:val="left"/>
       <w:pPr>
@@ -645,6 +479,7 @@
     <w:lvl w:ilvl="0">
       <w:start w:val="1"/>
       <w:numFmt w:val="bullet"/>
+      <w:pStyle w:val="ListBullet"/>
       <w:lvlText w:val=""/>
       <w:lvlJc w:val="left"/>
       <w:pPr>
@@ -659,79 +494,262 @@
     </w:lvl>
   </w:abstractNum>
   <w:abstractNum w:abstractNumId="9" w15:restartNumberingAfterBreak="0">
-    <w:nsid w:val="15BB6701"/>
+    <w:nsid w:val="57536287"/>
     <w:multiLevelType w:val="hybridMultilevel"/>
-    <w:tmpl w:val="883E410A"/>
-    <w:lvl w:ilvl="0" w:tplc="766C993C">
+    <w:tmpl w:val="F1B8AD7C"/>
+    <w:lvl w:ilvl="0" w:tplc="2ED4FFA4">
+      <w:numFmt w:val="bullet"/>
+      <w:lvlText w:val="•"/>
+      <w:lvlJc w:val="left"/>
+      <w:pPr>
+        <w:ind w:left="720" w:hanging="360"/>
+      </w:pPr>
+      <w:rPr>
+        <w:rFonts w:ascii="Century Gothic" w:eastAsia="Twentieth Century" w:hAnsi="Century Gothic" w:cstheme="minorBidi" w:hint="default"/>
+      </w:rPr>
+    </w:lvl>
+    <w:lvl w:ilvl="1" w:tplc="04100003" w:tentative="1">
       <w:start w:val="1"/>
       <w:numFmt w:val="bullet"/>
-      <w:pStyle w:val="ListBullet"/>
-      <w:lvlText w:val="▪"/>
+      <w:lvlText w:val="o"/>
       <w:lvlJc w:val="left"/>
       <w:pPr>
-        <w:ind w:left="360" w:hanging="180"/>
+        <w:ind w:left="1440" w:hanging="360"/>
       </w:pPr>
       <w:rPr>
-        <w:rFonts w:ascii="Tw Cen MT" w:hAnsi="Tw Cen MT"/>
+        <w:rFonts w:ascii="Courier New" w:hAnsi="Courier New" w:cs="Courier New" w:hint="default"/>
       </w:rPr>
     </w:lvl>
-    <w:lvl w:ilvl="1" w:tplc="766C993C">
+    <w:lvl w:ilvl="2" w:tplc="04100005" w:tentative="1">
       <w:start w:val="1"/>
       <w:numFmt w:val="bullet"/>
-      <w:lvlText w:val="▪"/>
+      <w:lvlText w:val=""/>
       <w:lvlJc w:val="left"/>
       <w:pPr>
-        <w:ind w:left="720" w:hanging="180"/>
+        <w:ind w:left="2160" w:hanging="360"/>
       </w:pPr>
       <w:rPr>
-        <w:rFonts w:ascii="Tw Cen MT" w:hAnsi="Tw Cen MT"/>
+        <w:rFonts w:ascii="Wingdings" w:hAnsi="Wingdings" w:hint="default"/>
       </w:rPr>
     </w:lvl>
-    <w:lvl w:ilvl="2" w:tplc="17EAE684">
+    <w:lvl w:ilvl="3" w:tplc="04100001" w:tentative="1">
       <w:start w:val="1"/>
       <w:numFmt w:val="bullet"/>
-      <w:lvlText w:val="▪"/>
+      <w:lvlText w:val=""/>
       <w:lvlJc w:val="left"/>
       <w:pPr>
-        <w:ind w:left="1080" w:hanging="180"/>
+        <w:ind w:left="2880" w:hanging="360"/>
       </w:pPr>
       <w:rPr>
-        <w:rFonts w:ascii="Tw Cen MT" w:hAnsi="Tw Cen MT"/>
+        <w:rFonts w:ascii="Symbol" w:hAnsi="Symbol" w:hint="default"/>
       </w:rPr>
     </w:lvl>
-    <w:lvl w:ilvl="3" w:tplc="1A8A8D48">
-      <w:numFmt w:val="decimal"/>
-      <w:lvlText w:val=""/>
+    <w:lvl w:ilvl="4" w:tplc="04100003" w:tentative="1">
+      <w:start w:val="1"/>
+      <w:numFmt w:val="bullet"/>
+      <w:lvlText w:val="o"/>
       <w:lvlJc w:val="left"/>
+      <w:pPr>
+        <w:ind w:left="3600" w:hanging="360"/>
+      </w:pPr>
+      <w:rPr>
+        <w:rFonts w:ascii="Courier New" w:hAnsi="Courier New" w:cs="Courier New" w:hint="default"/>
+      </w:rPr>
     </w:lvl>
-    <w:lvl w:ilvl="4" w:tplc="80002226">
-      <w:numFmt w:val="decimal"/>
-      <w:lvlText w:val=""/>
+    <w:lvl w:ilvl="5" w:tplc="04100005" w:tentative="1">
+      <w:start w:val="1"/>
+      <w:numFmt w:val="bullet"/>
+      <w:lvlText w:val=""/>
       <w:lvlJc w:val="left"/>
+      <w:pPr>
+        <w:ind w:left="4320" w:hanging="360"/>
+      </w:pPr>
+      <w:rPr>
+        <w:rFonts w:ascii="Wingdings" w:hAnsi="Wingdings" w:hint="default"/>
+      </w:rPr>
     </w:lvl>
-    <w:lvl w:ilvl="5" w:tplc="7546A328">
-      <w:numFmt w:val="decimal"/>
-      <w:lvlText w:val=""/>
+    <w:lvl w:ilvl="6" w:tplc="04100001" w:tentative="1">
+      <w:start w:val="1"/>
+      <w:numFmt w:val="bullet"/>
+      <w:lvlText w:val=""/>
       <w:lvlJc w:val="left"/>
+      <w:pPr>
+        <w:ind w:left="5040" w:hanging="360"/>
+      </w:pPr>
+      <w:rPr>
+        <w:rFonts w:ascii="Symbol" w:hAnsi="Symbol" w:hint="default"/>
+      </w:rPr>
     </w:lvl>
-    <w:lvl w:ilvl="6" w:tplc="AB4E6BFC">
-      <w:numFmt w:val="decimal"/>
-      <w:lvlText w:val=""/>
+    <w:lvl w:ilvl="7" w:tplc="04100003" w:tentative="1">
+      <w:start w:val="1"/>
+      <w:numFmt w:val="bullet"/>
+      <w:lvlText w:val="o"/>
       <w:lvlJc w:val="left"/>
+      <w:pPr>
+        <w:ind w:left="5760" w:hanging="360"/>
+      </w:pPr>
+      <w:rPr>
+        <w:rFonts w:ascii="Courier New" w:hAnsi="Courier New" w:cs="Courier New" w:hint="default"/>
+      </w:rPr>
     </w:lvl>
-    <w:lvl w:ilvl="7" w:tplc="3DD8044A">
-      <w:numFmt w:val="decimal"/>
-      <w:lvlText w:val=""/>
+    <w:lvl w:ilvl="8" w:tplc="04100005" w:tentative="1">
+      <w:start w:val="1"/>
+      <w:numFmt w:val="bullet"/>
+      <w:lvlText w:val=""/>
       <w:lvlJc w:val="left"/>
-    </w:lvl>
-    <w:lvl w:ilvl="8" w:tplc="00A28DF0">
-      <w:numFmt w:val="decimal"/>
-      <w:lvlText w:val=""/>
-      <w:lvlJc w:val="left"/>
+      <w:pPr>
+        <w:ind w:left="6480" w:hanging="360"/>
+      </w:pPr>
+      <w:rPr>
+        <w:rFonts w:ascii="Wingdings" w:hAnsi="Wingdings" w:hint="default"/>
+      </w:rPr>
     </w:lvl>
   </w:abstractNum>
-  <w:num w:numId="1" w16cid:durableId="521827007">
+  <w:abstractNum w:abstractNumId="10" w15:restartNumberingAfterBreak="0">
+    <w:nsid w:val="5C806ACD"/>
+    <w:multiLevelType w:val="hybridMultilevel"/>
+    <w:tmpl w:val="FEAE12C0"/>
+    <w:lvl w:ilvl="0" w:tplc="04100005">
+      <w:start w:val="1"/>
+      <w:numFmt w:val="bullet"/>
+      <w:lvlText w:val=""/>
+      <w:lvlJc w:val="left"/>
+      <w:pPr>
+        <w:ind w:left="360" w:hanging="360"/>
+      </w:pPr>
+      <w:rPr>
+        <w:rFonts w:ascii="Wingdings" w:hAnsi="Wingdings" w:hint="default"/>
+      </w:rPr>
+    </w:lvl>
+    <w:lvl w:ilvl="1" w:tplc="04100003" w:tentative="1">
+      <w:start w:val="1"/>
+      <w:numFmt w:val="bullet"/>
+      <w:lvlText w:val="o"/>
+      <w:lvlJc w:val="left"/>
+      <w:pPr>
+        <w:ind w:left="1080" w:hanging="360"/>
+      </w:pPr>
+      <w:rPr>
+        <w:rFonts w:ascii="Courier New" w:hAnsi="Courier New" w:cs="Courier New" w:hint="default"/>
+      </w:rPr>
+    </w:lvl>
+    <w:lvl w:ilvl="2" w:tplc="04100005" w:tentative="1">
+      <w:start w:val="1"/>
+      <w:numFmt w:val="bullet"/>
+      <w:lvlText w:val=""/>
+      <w:lvlJc w:val="left"/>
+      <w:pPr>
+        <w:ind w:left="1800" w:hanging="360"/>
+      </w:pPr>
+      <w:rPr>
+        <w:rFonts w:ascii="Wingdings" w:hAnsi="Wingdings" w:hint="default"/>
+      </w:rPr>
+    </w:lvl>
+    <w:lvl w:ilvl="3" w:tplc="04100001" w:tentative="1">
+      <w:start w:val="1"/>
+      <w:numFmt w:val="bullet"/>
+      <w:lvlText w:val=""/>
+      <w:lvlJc w:val="left"/>
+      <w:pPr>
+        <w:ind w:left="2520" w:hanging="360"/>
+      </w:pPr>
+      <w:rPr>
+        <w:rFonts w:ascii="Symbol" w:hAnsi="Symbol" w:hint="default"/>
+      </w:rPr>
+    </w:lvl>
+    <w:lvl w:ilvl="4" w:tplc="04100003" w:tentative="1">
+      <w:start w:val="1"/>
+      <w:numFmt w:val="bullet"/>
+      <w:lvlText w:val="o"/>
+      <w:lvlJc w:val="left"/>
+      <w:pPr>
+        <w:ind w:left="3240" w:hanging="360"/>
+      </w:pPr>
+      <w:rPr>
+        <w:rFonts w:ascii="Courier New" w:hAnsi="Courier New" w:cs="Courier New" w:hint="default"/>
+      </w:rPr>
+    </w:lvl>
+    <w:lvl w:ilvl="5" w:tplc="04100005" w:tentative="1">
+      <w:start w:val="1"/>
+      <w:numFmt w:val="bullet"/>
+      <w:lvlText w:val=""/>
+      <w:lvlJc w:val="left"/>
+      <w:pPr>
+        <w:ind w:left="3960" w:hanging="360"/>
+      </w:pPr>
+      <w:rPr>
+        <w:rFonts w:ascii="Wingdings" w:hAnsi="Wingdings" w:hint="default"/>
+      </w:rPr>
+    </w:lvl>
+    <w:lvl w:ilvl="6" w:tplc="04100001" w:tentative="1">
+      <w:start w:val="1"/>
+      <w:numFmt w:val="bullet"/>
+      <w:lvlText w:val=""/>
+      <w:lvlJc w:val="left"/>
+      <w:pPr>
+        <w:ind w:left="4680" w:hanging="360"/>
+      </w:pPr>
+      <w:rPr>
+        <w:rFonts w:ascii="Symbol" w:hAnsi="Symbol" w:hint="default"/>
+      </w:rPr>
+    </w:lvl>
+    <w:lvl w:ilvl="7" w:tplc="04100003" w:tentative="1">
+      <w:start w:val="1"/>
+      <w:numFmt w:val="bullet"/>
+      <w:lvlText w:val="o"/>
+      <w:lvlJc w:val="left"/>
+      <w:pPr>
+        <w:ind w:left="5400" w:hanging="360"/>
+      </w:pPr>
+      <w:rPr>
+        <w:rFonts w:ascii="Courier New" w:hAnsi="Courier New" w:cs="Courier New" w:hint="default"/>
+      </w:rPr>
+    </w:lvl>
+    <w:lvl w:ilvl="8" w:tplc="04100005" w:tentative="1">
+      <w:start w:val="1"/>
+      <w:numFmt w:val="bullet"/>
+      <w:lvlText w:val=""/>
+      <w:lvlJc w:val="left"/>
+      <w:pPr>
+        <w:ind w:left="6120" w:hanging="360"/>
+      </w:pPr>
+      <w:rPr>
+        <w:rFonts w:ascii="Wingdings" w:hAnsi="Wingdings" w:hint="default"/>
+      </w:rPr>
+    </w:lvl>
+  </w:abstractNum>
+  <w:num w:numId="1" w16cid:durableId="1322153592">
+    <w:abstractNumId w:val="5"/>
+  </w:num>
+  <w:num w:numId="2" w16cid:durableId="1895508615">
+    <w:abstractNumId w:val="2"/>
+  </w:num>
+  <w:num w:numId="3" w16cid:durableId="1924944858">
+    <w:abstractNumId w:val="8"/>
+  </w:num>
+  <w:num w:numId="4" w16cid:durableId="2060981625">
+    <w:abstractNumId w:val="1"/>
+  </w:num>
+  <w:num w:numId="5" w16cid:durableId="2135127965">
+    <w:abstractNumId w:val="3"/>
+  </w:num>
+  <w:num w:numId="6" w16cid:durableId="318964103">
+    <w:abstractNumId w:val="6"/>
+  </w:num>
+  <w:num w:numId="7" w16cid:durableId="387611739">
+    <w:abstractNumId w:val="4"/>
+  </w:num>
+  <w:num w:numId="8" w16cid:durableId="546526117">
     <w:abstractNumId w:val="9"/>
+  </w:num>
+  <w:num w:numId="9" w16cid:durableId="640158705">
+    <w:abstractNumId w:val="10"/>
+  </w:num>
+  <w:num w:numId="10" w16cid:durableId="938871999">
+    <w:abstractNumId w:val="7"/>
+  </w:num>
+  <w:num w:numId="11" w16cid:durableId="97333687">
+    <w:abstractNumId w:val="0"/>
   </w:num>
 </w:numbering>
 </file>
@@ -1127,7 +1145,7 @@
     <w:qFormat/>
     <w:rsid w:val="00FC693F"/>
     <w:rPr>
-      <w:rFonts w:ascii="Twentieth Century" w:eastAsia="Twentieth Century" w:hAnsi="Twentieth Century"/>
+      <w:rFonts w:ascii="Century Gothic" w:eastAsia="Century Gothic" w:hAnsi="Century Gothic"/>
     </w:rPr>
   </w:style>
   <w:style w:type="paragraph" w:styleId="Heading1">
@@ -1310,6 +1328,7 @@
     <w:rPr>
       <w:rFonts w:asciiTheme="majorHAnsi" w:eastAsiaTheme="majorEastAsia" w:hAnsiTheme="majorHAnsi" w:cstheme="majorBidi"/>
       <w:color w:val="4F81BD" w:themeColor="accent1"/>
+      <w:sz w:val="20"/>
       <w:szCs w:val="20"/>
     </w:rPr>
   </w:style>
@@ -1334,12 +1353,14 @@
       <w:i/>
       <w:iCs/>
       <w:color w:val="404040" w:themeColor="text1" w:themeTint="BF"/>
+      <w:sz w:val="20"/>
       <w:szCs w:val="20"/>
     </w:rPr>
   </w:style>
   <w:style w:type="character" w:default="1" w:styleId="DefaultParagraphFont">
     <w:name w:val="Default Paragraph Font"/>
     <w:uiPriority w:val="1"/>
+    <w:semiHidden/>
     <w:unhideWhenUsed/>
   </w:style>
   <w:style w:type="table" w:default="1" w:styleId="TableNormal">
@@ -1651,7 +1672,7 @@
     <w:rsid w:val="00326F90"/>
     <w:pPr>
       <w:numPr>
-        <w:numId w:val="1"/>
+        <w:numId w:val="3"/>
       </w:numPr>
       <w:contextualSpacing/>
     </w:pPr>
@@ -1663,9 +1684,9 @@
     <w:unhideWhenUsed/>
     <w:rsid w:val="00326F90"/>
     <w:pPr>
-      <w:tabs>
-        <w:tab w:val="num" w:pos="360"/>
-      </w:tabs>
+      <w:numPr>
+        <w:numId w:val="6"/>
+      </w:numPr>
       <w:contextualSpacing/>
     </w:pPr>
   </w:style>
@@ -1676,9 +1697,9 @@
     <w:unhideWhenUsed/>
     <w:rsid w:val="00326F90"/>
     <w:pPr>
-      <w:tabs>
-        <w:tab w:val="num" w:pos="360"/>
-      </w:tabs>
+      <w:numPr>
+        <w:numId w:val="1"/>
+      </w:numPr>
       <w:contextualSpacing/>
     </w:pPr>
   </w:style>
@@ -1689,9 +1710,9 @@
     <w:unhideWhenUsed/>
     <w:rsid w:val="00326F90"/>
     <w:pPr>
-      <w:tabs>
-        <w:tab w:val="num" w:pos="360"/>
-      </w:tabs>
+      <w:numPr>
+        <w:numId w:val="10"/>
+      </w:numPr>
       <w:contextualSpacing/>
     </w:pPr>
   </w:style>
@@ -1702,9 +1723,9 @@
     <w:unhideWhenUsed/>
     <w:rsid w:val="0029639D"/>
     <w:pPr>
-      <w:tabs>
-        <w:tab w:val="num" w:pos="360"/>
-      </w:tabs>
+      <w:numPr>
+        <w:numId w:val="5"/>
+      </w:numPr>
       <w:contextualSpacing/>
     </w:pPr>
   </w:style>
@@ -1715,9 +1736,9 @@
     <w:unhideWhenUsed/>
     <w:rsid w:val="0029639D"/>
     <w:pPr>
-      <w:tabs>
-        <w:tab w:val="num" w:pos="360"/>
-      </w:tabs>
+      <w:numPr>
+        <w:numId w:val="2"/>
+      </w:numPr>
       <w:contextualSpacing/>
     </w:pPr>
   </w:style>
@@ -12115,46 +12136,6 @@
         <w:shd w:val="clear" w:color="auto" w:fill="FBCAA2" w:themeFill="accent6" w:themeFillTint="7F"/>
       </w:tcPr>
     </w:tblStylePr>
-  </w:style>
-  <w:style w:type="paragraph" w:customStyle="1" w:styleId="BTOSectionHeading">
-    <w:name w:val="BTO Section Heading"/>
-    <w:rPr>
-      <w:rFonts w:ascii="Tw Cen MT" w:eastAsia="Tw Cen MT" w:hAnsi="Tw Cen MT"/>
-      <w:b/>
-      <w:color w:val="007364"/>
-      <w:sz w:val="32"/>
-    </w:rPr>
-  </w:style>
-  <w:style w:type="paragraph" w:customStyle="1" w:styleId="BTODate">
-    <w:name w:val="BTO Date"/>
-    <w:rPr>
-      <w:rFonts w:ascii="Tw Cen MT" w:eastAsia="Tw Cen MT" w:hAnsi="Tw Cen MT"/>
-      <w:b/>
-      <w:sz w:val="21"/>
-    </w:rPr>
-  </w:style>
-  <w:style w:type="paragraph" w:customStyle="1" w:styleId="BTORole">
-    <w:name w:val="BTO Role"/>
-    <w:rPr>
-      <w:rFonts w:ascii="Tw Cen MT" w:eastAsia="Tw Cen MT" w:hAnsi="Tw Cen MT"/>
-      <w:b/>
-      <w:sz w:val="21"/>
-    </w:rPr>
-  </w:style>
-  <w:style w:type="paragraph" w:customStyle="1" w:styleId="BTOCompany">
-    <w:name w:val="BTO Company"/>
-    <w:rPr>
-      <w:rFonts w:ascii="Tw Cen MT" w:eastAsia="Tw Cen MT" w:hAnsi="Tw Cen MT"/>
-      <w:sz w:val="21"/>
-    </w:rPr>
-  </w:style>
-  <w:style w:type="paragraph" w:customStyle="1" w:styleId="BTOSkillHeading">
-    <w:name w:val="BTO Skill Heading"/>
-    <w:rPr>
-      <w:rFonts w:ascii="Tw Cen MT" w:eastAsia="Tw Cen MT" w:hAnsi="Tw Cen MT"/>
-      <w:b/>
-      <w:sz w:val="21"/>
-    </w:rPr>
   </w:style>
 </w:styles>
 </file>

</xml_diff>

<commit_message>
Apply corrected BTO margins and exact inter-section blank lines
</commit_message>
<xml_diff>
--- a/skills/bto-cv/assets/BTO_CV_Template.docx
+++ b/skills/bto-cv/assets/BTO_CV_Template.docx
@@ -4,9 +4,8 @@
   <w:body>
     <w:p>
       <w:pPr>
-        <w:spacing w:after="180"/>
-        <w:ind w:hanging="284"/>
-        <w:jc w:val="center"/>
+        <w:spacing xmlns:w="http://schemas.openxmlformats.org/wordprocessingml/2006/main" w:after="0"/>
+        <w:jc xmlns:w="http://schemas.openxmlformats.org/wordprocessingml/2006/main" w:val="center"/>
       </w:pPr>
       <w:r>
         <w:rPr>
@@ -71,7 +70,7 @@
     <w:p>
       <w:pPr>
         <w:keepNext/>
-        <w:spacing w:before="110" w:after="80" w:line="240" w:lineRule="auto"/>
+        <w:spacing w:before="0" w:after="80" w:line="240" w:lineRule="auto"/>
       </w:pPr>
       <w:r>
         <w:rPr>
@@ -85,7 +84,7 @@
     <w:p>
       <w:pPr>
         <w:keepNext/>
-        <w:spacing w:before="110" w:after="80" w:line="240" w:lineRule="auto"/>
+        <w:spacing w:before="0" w:after="80" w:line="240" w:lineRule="auto"/>
       </w:pPr>
       <w:r>
         <w:rPr>
@@ -107,7 +106,7 @@
     <w:p>
       <w:pPr>
         <w:keepNext/>
-        <w:spacing w:before="110" w:after="80" w:line="240" w:lineRule="auto"/>
+        <w:spacing w:before="0" w:after="80" w:line="240" w:lineRule="auto"/>
       </w:pPr>
       <w:r>
         <w:rPr>
@@ -129,7 +128,7 @@
     <w:p>
       <w:pPr>
         <w:keepNext/>
-        <w:spacing w:before="110" w:after="80" w:line="240" w:lineRule="auto"/>
+        <w:spacing w:before="0" w:after="80" w:line="240" w:lineRule="auto"/>
       </w:pPr>
       <w:r>
         <w:rPr>
@@ -151,7 +150,7 @@
     <w:p>
       <w:pPr>
         <w:keepNext/>
-        <w:spacing w:before="110" w:after="80" w:line="240" w:lineRule="auto"/>
+        <w:spacing w:before="0" w:after="80" w:line="240" w:lineRule="auto"/>
       </w:pPr>
       <w:r>
         <w:rPr>
@@ -307,12 +306,38 @@
           <w:b/>
           <w:sz w:val="32"/>
         </w:rPr>
-        <w:t>{{layout_rr_afr_v1}}</w:t>
+        <w:t>{{layout_rr_afr_v2}}</w:t>
+      </w:r>
+    </w:p>
+    <w:p xmlns:w="http://schemas.openxmlformats.org/wordprocessingml/2006/main">
+      <w:pPr>
+        <w:keepNext/>
+        <w:spacing w:before="0" w:after="0" w:line="240" w:lineRule="auto"/>
+        <w:rPr>
+          <w:rFonts w:ascii="Century Gothic" w:hAnsi="Century Gothic"/>
+          <w:sz w:val="22"/>
+        </w:rPr>
+      </w:pPr>
+      <w:r>
+        <w:t>{{gap}}</w:t>
+      </w:r>
+    </w:p>
+    <w:p xmlns:w="http://schemas.openxmlformats.org/wordprocessingml/2006/main">
+      <w:pPr>
+        <w:keepNext/>
+        <w:spacing w:before="0" w:after="120" w:line="240" w:lineRule="auto"/>
+        <w:rPr>
+          <w:rFonts w:ascii="Century Gothic" w:hAnsi="Century Gothic"/>
+          <w:sz w:val="22"/>
+        </w:rPr>
+      </w:pPr>
+      <w:r>
+        <w:t>{{initial_gap}}</w:t>
       </w:r>
     </w:p>
     <w:sectPr>
       <w:pgSz w:w="11906" w:h="16838"/>
-      <w:pgMar w:top="1440" w:right="1274" w:bottom="1276" w:left="1440" w:header="708" w:footer="708" w:gutter="0"/>
+      <w:pgMar w:top="850" w:right="1134" w:bottom="709" w:left="1134" w:header="708" w:footer="708" w:gutter="0"/>
       <w:cols w:space="708"/>
       <w:docGrid w:linePitch="360"/>
     </w:sectPr>

</xml_diff>

<commit_message>
Apply corrected BTO margins and exact inter-section blank lines (#3)
</commit_message>
<xml_diff>
--- a/skills/bto-cv/assets/BTO_CV_Template.docx
+++ b/skills/bto-cv/assets/BTO_CV_Template.docx
@@ -4,9 +4,8 @@
   <w:body>
     <w:p>
       <w:pPr>
-        <w:spacing w:after="180"/>
-        <w:ind w:hanging="284"/>
-        <w:jc w:val="center"/>
+        <w:spacing xmlns:w="http://schemas.openxmlformats.org/wordprocessingml/2006/main" w:after="0"/>
+        <w:jc xmlns:w="http://schemas.openxmlformats.org/wordprocessingml/2006/main" w:val="center"/>
       </w:pPr>
       <w:r>
         <w:rPr>
@@ -71,7 +70,7 @@
     <w:p>
       <w:pPr>
         <w:keepNext/>
-        <w:spacing w:before="110" w:after="80" w:line="240" w:lineRule="auto"/>
+        <w:spacing w:before="0" w:after="80" w:line="240" w:lineRule="auto"/>
       </w:pPr>
       <w:r>
         <w:rPr>
@@ -85,7 +84,7 @@
     <w:p>
       <w:pPr>
         <w:keepNext/>
-        <w:spacing w:before="110" w:after="80" w:line="240" w:lineRule="auto"/>
+        <w:spacing w:before="0" w:after="80" w:line="240" w:lineRule="auto"/>
       </w:pPr>
       <w:r>
         <w:rPr>
@@ -107,7 +106,7 @@
     <w:p>
       <w:pPr>
         <w:keepNext/>
-        <w:spacing w:before="110" w:after="80" w:line="240" w:lineRule="auto"/>
+        <w:spacing w:before="0" w:after="80" w:line="240" w:lineRule="auto"/>
       </w:pPr>
       <w:r>
         <w:rPr>
@@ -129,7 +128,7 @@
     <w:p>
       <w:pPr>
         <w:keepNext/>
-        <w:spacing w:before="110" w:after="80" w:line="240" w:lineRule="auto"/>
+        <w:spacing w:before="0" w:after="80" w:line="240" w:lineRule="auto"/>
       </w:pPr>
       <w:r>
         <w:rPr>
@@ -151,7 +150,7 @@
     <w:p>
       <w:pPr>
         <w:keepNext/>
-        <w:spacing w:before="110" w:after="80" w:line="240" w:lineRule="auto"/>
+        <w:spacing w:before="0" w:after="80" w:line="240" w:lineRule="auto"/>
       </w:pPr>
       <w:r>
         <w:rPr>
@@ -307,12 +306,38 @@
           <w:b/>
           <w:sz w:val="32"/>
         </w:rPr>
-        <w:t>{{layout_rr_afr_v1}}</w:t>
+        <w:t>{{layout_rr_afr_v2}}</w:t>
+      </w:r>
+    </w:p>
+    <w:p xmlns:w="http://schemas.openxmlformats.org/wordprocessingml/2006/main">
+      <w:pPr>
+        <w:keepNext/>
+        <w:spacing w:before="0" w:after="0" w:line="240" w:lineRule="auto"/>
+        <w:rPr>
+          <w:rFonts w:ascii="Century Gothic" w:hAnsi="Century Gothic"/>
+          <w:sz w:val="22"/>
+        </w:rPr>
+      </w:pPr>
+      <w:r>
+        <w:t>{{gap}}</w:t>
+      </w:r>
+    </w:p>
+    <w:p xmlns:w="http://schemas.openxmlformats.org/wordprocessingml/2006/main">
+      <w:pPr>
+        <w:keepNext/>
+        <w:spacing w:before="0" w:after="120" w:line="240" w:lineRule="auto"/>
+        <w:rPr>
+          <w:rFonts w:ascii="Century Gothic" w:hAnsi="Century Gothic"/>
+          <w:sz w:val="22"/>
+        </w:rPr>
+      </w:pPr>
+      <w:r>
+        <w:t>{{initial_gap}}</w:t>
       </w:r>
     </w:p>
     <w:sectPr>
       <w:pgSz w:w="11906" w:h="16838"/>
-      <w:pgMar w:top="1440" w:right="1274" w:bottom="1276" w:left="1440" w:header="708" w:footer="708" w:gutter="0"/>
+      <w:pgMar w:top="850" w:right="1134" w:bottom="709" w:left="1134" w:header="708" w:footer="708" w:gutter="0"/>
       <w:cols w:space="708"/>
       <w:docGrid w:linePitch="360"/>
     </w:sectPr>

</xml_diff>